<commit_message>
Added new model descriptions to manual.
</commit_message>
<xml_diff>
--- a/manuals/Nemesis_3.0.docx
+++ b/manuals/Nemesis_3.0.docx
@@ -225,25 +225,7 @@
           <w:b/>
           <w:sz w:val="28"/>
         </w:rPr>
-        <w:t xml:space="preserve">P. G. J. Irwin, L.N. Fletcher, N.A. </w:t>
-      </w:r>
-      <w:proofErr w:type="spellStart"/>
-      <w:r>
-        <w:rPr>
-          <w:rFonts w:ascii="Times New Roman" w:hAnsi="Times New Roman"/>
-          <w:b/>
-          <w:sz w:val="28"/>
-        </w:rPr>
-        <w:t>Teanby</w:t>
-      </w:r>
-      <w:proofErr w:type="spellEnd"/>
-      <w:r>
-        <w:rPr>
-          <w:rFonts w:ascii="Times New Roman" w:hAnsi="Times New Roman"/>
-          <w:b/>
-          <w:sz w:val="28"/>
-        </w:rPr>
-        <w:t>, C.A. Nixon, S.B. Calcutt et al.</w:t>
+        <w:t>P. G. J. Irwin, L.N. Fletcher, N.A. Teanby, C.A. Nixon, S.B. Calcutt et al.</w:t>
       </w:r>
     </w:p>
     <w:p>
@@ -1456,7 +1438,7 @@
             <w:noProof/>
             <w:webHidden/>
           </w:rPr>
-          <w:t>27</w:t>
+          <w:t>28</w:t>
         </w:r>
         <w:r>
           <w:rPr>
@@ -1531,7 +1513,7 @@
             <w:noProof/>
             <w:webHidden/>
           </w:rPr>
-          <w:t>29</w:t>
+          <w:t>30</w:t>
         </w:r>
         <w:r>
           <w:rPr>
@@ -1681,7 +1663,7 @@
             <w:noProof/>
             <w:webHidden/>
           </w:rPr>
-          <w:t>32</w:t>
+          <w:t>33</w:t>
         </w:r>
         <w:r>
           <w:rPr>
@@ -1906,7 +1888,7 @@
             <w:noProof/>
             <w:webHidden/>
           </w:rPr>
-          <w:t>33</w:t>
+          <w:t>34</w:t>
         </w:r>
         <w:r>
           <w:rPr>
@@ -1981,7 +1963,7 @@
             <w:noProof/>
             <w:webHidden/>
           </w:rPr>
-          <w:t>34</w:t>
+          <w:t>35</w:t>
         </w:r>
         <w:r>
           <w:rPr>
@@ -2130,7 +2112,7 @@
             <w:noProof/>
             <w:webHidden/>
           </w:rPr>
-          <w:t>37</w:t>
+          <w:t>38</w:t>
         </w:r>
         <w:r>
           <w:rPr>
@@ -2204,7 +2186,7 @@
             <w:noProof/>
             <w:webHidden/>
           </w:rPr>
-          <w:t>37</w:t>
+          <w:t>38</w:t>
         </w:r>
         <w:r>
           <w:rPr>
@@ -2279,7 +2261,7 @@
             <w:noProof/>
             <w:webHidden/>
           </w:rPr>
-          <w:t>38</w:t>
+          <w:t>39</w:t>
         </w:r>
         <w:r>
           <w:rPr>
@@ -2354,7 +2336,7 @@
             <w:noProof/>
             <w:webHidden/>
           </w:rPr>
-          <w:t>38</w:t>
+          <w:t>39</w:t>
         </w:r>
         <w:r>
           <w:rPr>
@@ -2654,7 +2636,7 @@
             <w:noProof/>
             <w:webHidden/>
           </w:rPr>
-          <w:t>39</w:t>
+          <w:t>40</w:t>
         </w:r>
         <w:r>
           <w:rPr>
@@ -2954,7 +2936,7 @@
             <w:noProof/>
             <w:webHidden/>
           </w:rPr>
-          <w:t>40</w:t>
+          <w:t>41</w:t>
         </w:r>
         <w:r>
           <w:rPr>
@@ -14351,112 +14333,92 @@
           <w:i/>
           <w:iCs/>
         </w:rPr>
-        <w:t xml:space="preserve">Crème </w:t>
-      </w:r>
-      <w:proofErr w:type="spellStart"/>
+        <w:t>Crème Brûlée</w:t>
+      </w:r>
+      <w:r>
+        <w:rPr>
+          <w:rFonts w:ascii="Times New Roman" w:hAnsi="Times New Roman"/>
+        </w:rPr>
+        <w:t xml:space="preserve"> layering scheme of </w:t>
+      </w:r>
+      <w:proofErr w:type="spellStart"/>
+      <w:r>
+        <w:rPr>
+          <w:rFonts w:ascii="Times New Roman" w:hAnsi="Times New Roman"/>
+        </w:rPr>
+        <w:t>Sromovsky</w:t>
+      </w:r>
+      <w:proofErr w:type="spellEnd"/>
+      <w:r>
+        <w:rPr>
+          <w:rFonts w:ascii="Times New Roman" w:hAnsi="Times New Roman"/>
+        </w:rPr>
+        <w:t xml:space="preserve"> et al (2017)/Baines et al (2016) is used. Next lines contain the base pressure, opacity and fractional scale height of the main tropospheric cloud layer</w:t>
+      </w:r>
+      <w:r>
+        <w:rPr>
+          <w:rFonts w:ascii="Times New Roman" w:hAnsi="Times New Roman"/>
+        </w:rPr>
+        <w:t xml:space="preserve"> (TC)</w:t>
+      </w:r>
+      <w:r>
+        <w:rPr>
+          <w:rFonts w:ascii="Times New Roman" w:hAnsi="Times New Roman"/>
+        </w:rPr>
+        <w:t xml:space="preserve">, then the base pressure and opacity of the chromophore layer, </w:t>
+      </w:r>
+      <w:r>
+        <w:rPr>
+          <w:rFonts w:ascii="Times New Roman" w:hAnsi="Times New Roman"/>
+        </w:rPr>
+        <w:t xml:space="preserve">(CB), </w:t>
+      </w:r>
+      <w:r>
+        <w:rPr>
+          <w:rFonts w:ascii="Times New Roman" w:hAnsi="Times New Roman"/>
+        </w:rPr>
+        <w:t>then the base pressure and opacity of the stratospheric haze layer</w:t>
+      </w:r>
+      <w:r>
+        <w:rPr>
+          <w:rFonts w:ascii="Times New Roman" w:hAnsi="Times New Roman"/>
+        </w:rPr>
+        <w:t xml:space="preserve"> (SH)</w:t>
+      </w:r>
+      <w:r>
+        <w:rPr>
+          <w:rFonts w:ascii="Times New Roman" w:hAnsi="Times New Roman"/>
+        </w:rPr>
+        <w:t xml:space="preserve">, all together with errors. </w:t>
+      </w:r>
+      <w:r>
+        <w:rPr>
+          <w:rFonts w:ascii="Times New Roman" w:hAnsi="Times New Roman"/>
+        </w:rPr>
+        <w:t>Finally, the last line specifies the top pressure of the CB as a fraction of the base pressure (</w:t>
+      </w:r>
+      <w:proofErr w:type="spellStart"/>
+      <w:r>
+        <w:rPr>
+          <w:rFonts w:ascii="Times New Roman" w:hAnsi="Times New Roman"/>
+        </w:rPr>
+        <w:t>eg.</w:t>
+      </w:r>
+      <w:proofErr w:type="spellEnd"/>
+      <w:r>
+        <w:rPr>
+          <w:rFonts w:ascii="Times New Roman" w:hAnsi="Times New Roman"/>
+        </w:rPr>
+        <w:t xml:space="preserve"> setting this line to 0.2 would make the top pressure of the CB equal to 1/5 of the CB base pressure). To use the default </w:t>
+      </w:r>
       <w:r>
         <w:rPr>
           <w:rFonts w:ascii="Times New Roman" w:hAnsi="Times New Roman"/>
           <w:i/>
           <w:iCs/>
         </w:rPr>
-        <w:t>Brûlée</w:t>
-      </w:r>
-      <w:proofErr w:type="spellEnd"/>
-      <w:r>
-        <w:rPr>
-          <w:rFonts w:ascii="Times New Roman" w:hAnsi="Times New Roman"/>
-        </w:rPr>
-        <w:t xml:space="preserve"> layering scheme of </w:t>
-      </w:r>
-      <w:proofErr w:type="spellStart"/>
-      <w:r>
-        <w:rPr>
-          <w:rFonts w:ascii="Times New Roman" w:hAnsi="Times New Roman"/>
-        </w:rPr>
-        <w:t>Sromovsky</w:t>
-      </w:r>
-      <w:proofErr w:type="spellEnd"/>
-      <w:r>
-        <w:rPr>
-          <w:rFonts w:ascii="Times New Roman" w:hAnsi="Times New Roman"/>
-        </w:rPr>
-        <w:t xml:space="preserve"> et al (2017)/Baines et al (2016) is used. Next lines contain the base pressure, opacity and fractional scale height of the main tropospheric cloud layer</w:t>
-      </w:r>
-      <w:r>
-        <w:rPr>
-          <w:rFonts w:ascii="Times New Roman" w:hAnsi="Times New Roman"/>
-        </w:rPr>
-        <w:t xml:space="preserve"> (TC)</w:t>
-      </w:r>
-      <w:r>
-        <w:rPr>
-          <w:rFonts w:ascii="Times New Roman" w:hAnsi="Times New Roman"/>
-        </w:rPr>
-        <w:t xml:space="preserve">, then the base pressure and opacity of the chromophore layer, </w:t>
-      </w:r>
-      <w:r>
-        <w:rPr>
-          <w:rFonts w:ascii="Times New Roman" w:hAnsi="Times New Roman"/>
-        </w:rPr>
-        <w:t xml:space="preserve">(CB), </w:t>
-      </w:r>
-      <w:r>
-        <w:rPr>
-          <w:rFonts w:ascii="Times New Roman" w:hAnsi="Times New Roman"/>
-        </w:rPr>
-        <w:t>then the base pressure and opacity of the stratospheric haze layer</w:t>
-      </w:r>
-      <w:r>
-        <w:rPr>
-          <w:rFonts w:ascii="Times New Roman" w:hAnsi="Times New Roman"/>
-        </w:rPr>
-        <w:t xml:space="preserve"> (SH)</w:t>
-      </w:r>
-      <w:r>
-        <w:rPr>
-          <w:rFonts w:ascii="Times New Roman" w:hAnsi="Times New Roman"/>
-        </w:rPr>
-        <w:t xml:space="preserve">, all together with errors. </w:t>
-      </w:r>
-      <w:r>
-        <w:rPr>
-          <w:rFonts w:ascii="Times New Roman" w:hAnsi="Times New Roman"/>
-        </w:rPr>
-        <w:t>Finally, the last line specifies the top pressure of the CB as a fraction of the base pressure (</w:t>
-      </w:r>
-      <w:proofErr w:type="spellStart"/>
-      <w:r>
-        <w:rPr>
-          <w:rFonts w:ascii="Times New Roman" w:hAnsi="Times New Roman"/>
-        </w:rPr>
-        <w:t>eg.</w:t>
-      </w:r>
-      <w:proofErr w:type="spellEnd"/>
-      <w:r>
-        <w:rPr>
-          <w:rFonts w:ascii="Times New Roman" w:hAnsi="Times New Roman"/>
-        </w:rPr>
-        <w:t xml:space="preserve"> setting this line to 0.2 would make the top pressure of the CB equal to 1/5 of the CB base pressure). To use the default </w:t>
-      </w:r>
-      <w:r>
-        <w:rPr>
-          <w:rFonts w:ascii="Times New Roman" w:hAnsi="Times New Roman"/>
-          <w:i/>
-          <w:iCs/>
-        </w:rPr>
-        <w:t xml:space="preserve">Crème </w:t>
-      </w:r>
-      <w:proofErr w:type="spellStart"/>
-      <w:r>
-        <w:rPr>
-          <w:rFonts w:ascii="Times New Roman" w:hAnsi="Times New Roman"/>
-          <w:i/>
-          <w:iCs/>
-        </w:rPr>
-        <w:t>Brûlée</w:t>
-      </w:r>
-      <w:proofErr w:type="spellEnd"/>
+        <w:t>Crème Brûlée</w:t>
+      </w:r>
       <w:r>
         <w:rPr>
           <w:rFonts w:ascii="Times New Roman" w:hAnsi="Times New Roman"/>
@@ -27865,6 +27827,481 @@
     </w:p>
     <w:p>
       <w:pPr>
+        <w:pStyle w:val="ListParagraph"/>
+        <w:rPr>
+          <w:rFonts w:ascii="Times New Roman" w:hAnsi="Times New Roman"/>
+        </w:rPr>
+      </w:pPr>
+    </w:p>
+    <w:p>
+      <w:pPr>
+        <w:numPr>
+          <w:ilvl w:val="0"/>
+          <w:numId w:val="18"/>
+        </w:numPr>
+        <w:ind w:left="709" w:hanging="425"/>
+        <w:jc w:val="both"/>
+        <w:rPr>
+          <w:rFonts w:ascii="Times New Roman" w:hAnsi="Times New Roman"/>
+        </w:rPr>
+      </w:pPr>
+      <w:r>
+        <w:rPr>
+          <w:rFonts w:ascii="Times New Roman" w:hAnsi="Times New Roman"/>
+        </w:rPr>
+        <w:t xml:space="preserve">Like model </w:t>
+      </w:r>
+      <w:r>
+        <w:rPr>
+          <w:rFonts w:ascii="Times New Roman" w:hAnsi="Times New Roman"/>
+        </w:rPr>
+        <w:t>60</w:t>
+      </w:r>
+      <w:r>
+        <w:rPr>
+          <w:rFonts w:ascii="Times New Roman" w:hAnsi="Times New Roman"/>
+        </w:rPr>
+        <w:t xml:space="preserve">, </w:t>
+      </w:r>
+      <w:r>
+        <w:rPr>
+          <w:rFonts w:ascii="Times New Roman" w:hAnsi="Times New Roman"/>
+        </w:rPr>
+        <w:t>but</w:t>
+      </w:r>
+      <w:r>
+        <w:rPr>
+          <w:rFonts w:ascii="Times New Roman" w:hAnsi="Times New Roman"/>
+        </w:rPr>
+        <w:t xml:space="preserve"> cloud is specified by its </w:t>
+      </w:r>
+      <w:r>
+        <w:rPr>
+          <w:rFonts w:ascii="Times New Roman" w:hAnsi="Times New Roman"/>
+        </w:rPr>
+        <w:t>maximum specific density</w:t>
+      </w:r>
+      <w:r>
+        <w:rPr>
+          <w:rFonts w:ascii="Times New Roman" w:hAnsi="Times New Roman"/>
+        </w:rPr>
+        <w:t xml:space="preserve"> at an upper pressure level, the </w:t>
+      </w:r>
+      <w:proofErr w:type="spellStart"/>
+      <w:r>
+        <w:rPr>
+          <w:rFonts w:ascii="Times New Roman" w:hAnsi="Times New Roman"/>
+        </w:rPr>
+        <w:t>fsh</w:t>
+      </w:r>
+      <w:proofErr w:type="spellEnd"/>
+      <w:r>
+        <w:rPr>
+          <w:rFonts w:ascii="Times New Roman" w:hAnsi="Times New Roman"/>
+        </w:rPr>
+        <w:t xml:space="preserve"> below that, a bottom cloud pressure and then width of the gaussian cut-off above and below. </w:t>
+      </w:r>
+      <w:r>
+        <w:rPr>
+          <w:rFonts w:ascii="Times New Roman" w:hAnsi="Times New Roman"/>
+          <w:color w:val="000000"/>
+        </w:rPr>
+        <w:t>The next lines of the .</w:t>
+      </w:r>
+      <w:proofErr w:type="spellStart"/>
+      <w:r>
+        <w:rPr>
+          <w:rFonts w:ascii="Times New Roman" w:hAnsi="Times New Roman"/>
+          <w:color w:val="000000"/>
+        </w:rPr>
+        <w:t>apr</w:t>
+      </w:r>
+      <w:proofErr w:type="spellEnd"/>
+      <w:r>
+        <w:rPr>
+          <w:rFonts w:ascii="Times New Roman" w:hAnsi="Times New Roman"/>
+          <w:color w:val="000000"/>
+        </w:rPr>
+        <w:t xml:space="preserve"> file then contains the </w:t>
+      </w:r>
+      <w:r>
+        <w:rPr>
+          <w:rFonts w:ascii="Times New Roman" w:hAnsi="Times New Roman"/>
+          <w:i/>
+          <w:color w:val="000000"/>
+        </w:rPr>
+        <w:t>a priori</w:t>
+      </w:r>
+      <w:r>
+        <w:rPr>
+          <w:rFonts w:ascii="Times New Roman" w:hAnsi="Times New Roman"/>
+          <w:color w:val="000000"/>
+        </w:rPr>
+        <w:t xml:space="preserve"> </w:t>
+      </w:r>
+      <w:r>
+        <w:rPr>
+          <w:rFonts w:ascii="Times New Roman" w:hAnsi="Times New Roman"/>
+          <w:color w:val="000000"/>
+        </w:rPr>
+        <w:t>specific density</w:t>
+      </w:r>
+      <w:r>
+        <w:rPr>
+          <w:rFonts w:ascii="Times New Roman" w:hAnsi="Times New Roman"/>
+          <w:color w:val="000000"/>
+        </w:rPr>
+        <w:t xml:space="preserve">, the </w:t>
+      </w:r>
+      <w:r>
+        <w:rPr>
+          <w:rFonts w:ascii="Times New Roman" w:hAnsi="Times New Roman"/>
+          <w:i/>
+          <w:color w:val="000000"/>
+        </w:rPr>
+        <w:t>a priori</w:t>
+      </w:r>
+      <w:r>
+        <w:rPr>
+          <w:rFonts w:ascii="Times New Roman" w:hAnsi="Times New Roman"/>
+          <w:color w:val="000000"/>
+        </w:rPr>
+        <w:t xml:space="preserve"> cloud top pressure, the </w:t>
+      </w:r>
+      <w:r>
+        <w:rPr>
+          <w:rFonts w:ascii="Times New Roman" w:hAnsi="Times New Roman"/>
+          <w:i/>
+          <w:color w:val="000000"/>
+        </w:rPr>
+        <w:t>a priori</w:t>
+      </w:r>
+      <w:r>
+        <w:rPr>
+          <w:rFonts w:ascii="Times New Roman" w:hAnsi="Times New Roman"/>
+          <w:color w:val="000000"/>
+        </w:rPr>
+        <w:t xml:space="preserve"> </w:t>
+      </w:r>
+      <w:r>
+        <w:rPr>
+          <w:rFonts w:ascii="Times New Roman" w:hAnsi="Times New Roman"/>
+          <w:color w:val="000000"/>
+        </w:rPr>
+        <w:t>cloud</w:t>
+      </w:r>
+      <w:r>
+        <w:rPr>
+          <w:rFonts w:ascii="Times New Roman" w:hAnsi="Times New Roman"/>
+          <w:color w:val="000000"/>
+        </w:rPr>
+        <w:t xml:space="preserve"> bottom pressure</w:t>
+      </w:r>
+      <w:r>
+        <w:rPr>
+          <w:rFonts w:ascii="Times New Roman" w:hAnsi="Times New Roman"/>
+          <w:color w:val="000000"/>
+        </w:rPr>
+        <w:t xml:space="preserve">, the </w:t>
+      </w:r>
+      <w:r>
+        <w:rPr>
+          <w:rFonts w:ascii="Times New Roman" w:hAnsi="Times New Roman"/>
+          <w:i/>
+          <w:color w:val="000000"/>
+        </w:rPr>
+        <w:t>a priori</w:t>
+      </w:r>
+      <w:r>
+        <w:rPr>
+          <w:rFonts w:ascii="Times New Roman" w:hAnsi="Times New Roman"/>
+          <w:color w:val="000000"/>
+        </w:rPr>
+        <w:t xml:space="preserve"> </w:t>
+      </w:r>
+      <w:r>
+        <w:rPr>
+          <w:rFonts w:ascii="Times New Roman" w:hAnsi="Times New Roman"/>
+          <w:color w:val="000000"/>
+        </w:rPr>
+        <w:t xml:space="preserve">fractional scale height between these levels, and finally, </w:t>
+      </w:r>
+      <w:r>
+        <w:rPr>
+          <w:rFonts w:ascii="Times New Roman" w:hAnsi="Times New Roman"/>
+          <w:color w:val="000000"/>
+        </w:rPr>
+        <w:t>the gaussian fall off above and below the cloud, all with their respective errors. All quantities are taken as logs.</w:t>
+      </w:r>
+    </w:p>
+    <w:p>
+      <w:pPr>
+        <w:pStyle w:val="ListParagraph"/>
+        <w:rPr>
+          <w:rFonts w:ascii="Times New Roman" w:hAnsi="Times New Roman"/>
+        </w:rPr>
+      </w:pPr>
+    </w:p>
+    <w:p>
+      <w:pPr>
+        <w:ind w:left="709"/>
+        <w:jc w:val="both"/>
+        <w:rPr>
+          <w:rFonts w:ascii="Times New Roman" w:hAnsi="Times New Roman"/>
+        </w:rPr>
+      </w:pPr>
+    </w:p>
+    <w:p>
+      <w:pPr>
+        <w:numPr>
+          <w:ilvl w:val="0"/>
+          <w:numId w:val="18"/>
+        </w:numPr>
+        <w:ind w:left="709" w:hanging="425"/>
+        <w:jc w:val="both"/>
+        <w:rPr>
+          <w:rFonts w:ascii="Times New Roman" w:hAnsi="Times New Roman"/>
+        </w:rPr>
+      </w:pPr>
+      <w:r>
+        <w:rPr>
+          <w:rFonts w:ascii="Times New Roman" w:hAnsi="Times New Roman"/>
+        </w:rPr>
+        <w:lastRenderedPageBreak/>
+        <w:t>Like model 5</w:t>
+      </w:r>
+      <w:r>
+        <w:rPr>
+          <w:rFonts w:ascii="Times New Roman" w:hAnsi="Times New Roman"/>
+        </w:rPr>
+        <w:t>6.</w:t>
+      </w:r>
+      <w:r>
+        <w:rPr>
+          <w:rFonts w:ascii="Times New Roman" w:hAnsi="Times New Roman"/>
+        </w:rPr>
+        <w:t xml:space="preserve"> </w:t>
+      </w:r>
+      <w:r>
+        <w:rPr>
+          <w:rFonts w:ascii="Times New Roman" w:hAnsi="Times New Roman"/>
+          <w:color w:val="000000"/>
+        </w:rPr>
+        <w:t>Model requires</w:t>
+      </w:r>
+      <w:r>
+        <w:rPr>
+          <w:rFonts w:ascii="Times New Roman" w:hAnsi="Times New Roman"/>
+          <w:color w:val="000000"/>
+        </w:rPr>
+        <w:t xml:space="preserve"> </w:t>
+      </w:r>
+      <w:r>
+        <w:rPr>
+          <w:rFonts w:ascii="Times New Roman" w:hAnsi="Times New Roman"/>
+          <w:color w:val="000000"/>
+        </w:rPr>
+        <w:t>the deep gas abundance</w:t>
+      </w:r>
+      <w:r>
+        <w:rPr>
+          <w:rFonts w:ascii="Times New Roman" w:hAnsi="Times New Roman"/>
+          <w:color w:val="000000"/>
+        </w:rPr>
+        <w:t>, middle gas abundance (above a fixed pressure level)</w:t>
+      </w:r>
+      <w:r>
+        <w:rPr>
+          <w:rFonts w:ascii="Times New Roman" w:hAnsi="Times New Roman"/>
+          <w:color w:val="000000"/>
+        </w:rPr>
+        <w:t xml:space="preserve">, desired </w:t>
+      </w:r>
+      <w:r>
+        <w:rPr>
+          <w:rFonts w:ascii="Times New Roman" w:hAnsi="Times New Roman"/>
+          <w:color w:val="000000"/>
+        </w:rPr>
+        <w:t xml:space="preserve">maximum </w:t>
+      </w:r>
+      <w:r>
+        <w:rPr>
+          <w:rFonts w:ascii="Times New Roman" w:hAnsi="Times New Roman"/>
+          <w:color w:val="000000"/>
+        </w:rPr>
+        <w:t>relative</w:t>
+      </w:r>
+      <w:r>
+        <w:rPr>
+          <w:rFonts w:ascii="Times New Roman" w:hAnsi="Times New Roman"/>
+          <w:color w:val="000000"/>
+        </w:rPr>
+        <w:t xml:space="preserve"> humidity</w:t>
+      </w:r>
+      <w:r>
+        <w:rPr>
+          <w:rFonts w:ascii="Times New Roman" w:hAnsi="Times New Roman"/>
+          <w:color w:val="000000"/>
+        </w:rPr>
+        <w:t xml:space="preserve"> after condensation, and then rate of fall-off of RH above that level.</w:t>
+      </w:r>
+      <w:r>
+        <w:rPr>
+          <w:rFonts w:ascii="Times New Roman" w:hAnsi="Times New Roman"/>
+          <w:color w:val="000000"/>
+        </w:rPr>
+        <w:t xml:space="preserve"> The next lines of the .</w:t>
+      </w:r>
+      <w:proofErr w:type="spellStart"/>
+      <w:r>
+        <w:rPr>
+          <w:rFonts w:ascii="Times New Roman" w:hAnsi="Times New Roman"/>
+          <w:color w:val="000000"/>
+        </w:rPr>
+        <w:t>apr</w:t>
+      </w:r>
+      <w:proofErr w:type="spellEnd"/>
+      <w:r>
+        <w:rPr>
+          <w:rFonts w:ascii="Times New Roman" w:hAnsi="Times New Roman"/>
+          <w:color w:val="000000"/>
+        </w:rPr>
+        <w:t xml:space="preserve"> file then contain: 1) the </w:t>
+      </w:r>
+      <w:r>
+        <w:rPr>
+          <w:rFonts w:ascii="Times New Roman" w:hAnsi="Times New Roman"/>
+          <w:i/>
+          <w:color w:val="000000"/>
+        </w:rPr>
+        <w:t>a priori</w:t>
+      </w:r>
+      <w:r>
+        <w:rPr>
+          <w:rFonts w:ascii="Times New Roman" w:hAnsi="Times New Roman"/>
+          <w:color w:val="000000"/>
+        </w:rPr>
+        <w:t xml:space="preserve"> </w:t>
+      </w:r>
+      <w:r>
+        <w:rPr>
+          <w:rFonts w:ascii="Times New Roman" w:hAnsi="Times New Roman"/>
+          <w:color w:val="000000"/>
+        </w:rPr>
+        <w:t xml:space="preserve">deep abundance and error; 1) the </w:t>
+      </w:r>
+      <w:r>
+        <w:rPr>
+          <w:rFonts w:ascii="Times New Roman" w:hAnsi="Times New Roman"/>
+          <w:i/>
+          <w:color w:val="000000"/>
+        </w:rPr>
+        <w:t>a priori</w:t>
+      </w:r>
+      <w:r>
+        <w:rPr>
+          <w:rFonts w:ascii="Times New Roman" w:hAnsi="Times New Roman"/>
+          <w:color w:val="000000"/>
+        </w:rPr>
+        <w:t xml:space="preserve"> </w:t>
+      </w:r>
+      <w:r>
+        <w:rPr>
+          <w:rFonts w:ascii="Times New Roman" w:hAnsi="Times New Roman"/>
+          <w:color w:val="000000"/>
+        </w:rPr>
+        <w:t xml:space="preserve">middle abundance and error; 3) the </w:t>
+      </w:r>
+      <w:r>
+        <w:rPr>
+          <w:rFonts w:ascii="Times New Roman" w:hAnsi="Times New Roman"/>
+          <w:i/>
+          <w:color w:val="000000"/>
+        </w:rPr>
+        <w:t>a priori</w:t>
+      </w:r>
+      <w:r>
+        <w:rPr>
+          <w:rFonts w:ascii="Times New Roman" w:hAnsi="Times New Roman"/>
+          <w:color w:val="000000"/>
+        </w:rPr>
+        <w:t xml:space="preserve"> </w:t>
+      </w:r>
+      <w:r>
+        <w:rPr>
+          <w:rFonts w:ascii="Times New Roman" w:hAnsi="Times New Roman"/>
+          <w:color w:val="000000"/>
+        </w:rPr>
+        <w:t>relative humidity (RH) and error</w:t>
+      </w:r>
+      <w:r>
+        <w:rPr>
+          <w:rFonts w:ascii="Times New Roman" w:hAnsi="Times New Roman"/>
+          <w:color w:val="000000"/>
+        </w:rPr>
+        <w:t xml:space="preserve">; </w:t>
+      </w:r>
+      <w:r>
+        <w:rPr>
+          <w:rFonts w:ascii="Times New Roman" w:hAnsi="Times New Roman"/>
+          <w:color w:val="000000"/>
+        </w:rPr>
+        <w:t xml:space="preserve">4) </w:t>
+      </w:r>
+      <w:r>
+        <w:rPr>
+          <w:rFonts w:ascii="Times New Roman" w:hAnsi="Times New Roman"/>
+          <w:color w:val="000000"/>
+        </w:rPr>
+        <w:t xml:space="preserve">the </w:t>
+      </w:r>
+      <w:r>
+        <w:rPr>
+          <w:rFonts w:ascii="Times New Roman" w:hAnsi="Times New Roman"/>
+          <w:color w:val="000000"/>
+        </w:rPr>
+        <w:t xml:space="preserve">scale height of the </w:t>
+      </w:r>
+      <w:r>
+        <w:rPr>
+          <w:rFonts w:ascii="Times New Roman" w:hAnsi="Times New Roman"/>
+          <w:color w:val="000000"/>
+        </w:rPr>
+        <w:t>RH</w:t>
+      </w:r>
+      <w:r>
+        <w:rPr>
+          <w:rFonts w:ascii="Times New Roman" w:hAnsi="Times New Roman"/>
+          <w:color w:val="000000"/>
+        </w:rPr>
+        <w:t xml:space="preserve"> above the condensation level</w:t>
+      </w:r>
+      <w:r>
+        <w:rPr>
+          <w:rFonts w:ascii="Times New Roman" w:hAnsi="Times New Roman"/>
+          <w:color w:val="000000"/>
+        </w:rPr>
+        <w:t>; and 5) the fixed pressure level</w:t>
+      </w:r>
+      <w:r>
+        <w:rPr>
+          <w:rFonts w:ascii="Times New Roman" w:hAnsi="Times New Roman"/>
+          <w:color w:val="000000"/>
+        </w:rPr>
+        <w:t>.</w:t>
+      </w:r>
+    </w:p>
+    <w:p>
+      <w:pPr>
+        <w:ind w:left="709"/>
+        <w:jc w:val="both"/>
+        <w:rPr>
+          <w:rFonts w:ascii="Times New Roman" w:hAnsi="Times New Roman"/>
+        </w:rPr>
+      </w:pPr>
+    </w:p>
+    <w:p>
+      <w:pPr>
         <w:tabs>
           <w:tab w:val="left" w:pos="284"/>
         </w:tabs>
@@ -28854,7 +29291,6 @@
         <w:rPr>
           <w:rFonts w:ascii="Times New Roman" w:hAnsi="Times New Roman"/>
         </w:rPr>
-        <w:lastRenderedPageBreak/>
         <w:t>PHILIMIT is the percentage convergence limit. If the percentage reduction of the cost function PHI between iterations is less than PHILIMIT then the retrieval is deemed to have converged, and the retrieval terminated early.</w:t>
       </w:r>
     </w:p>
@@ -29241,6 +29677,7 @@
         <w:rPr>
           <w:rFonts w:ascii="Times New Roman" w:hAnsi="Times New Roman"/>
         </w:rPr>
+        <w:lastRenderedPageBreak/>
         <w:t>If LIN is set to 3, then the previous retrievals are read in, and if any variable is the same as one of the variables to be retrieved (as listed in the .</w:t>
       </w:r>
       <w:proofErr w:type="spellStart"/>
@@ -29456,7 +29893,6 @@
           <w:rFonts w:ascii="Times New Roman" w:hAnsi="Times New Roman"/>
           <w:b/>
         </w:rPr>
-        <w:lastRenderedPageBreak/>
         <w:t>3</w:t>
       </w:r>
       <w:r>
@@ -30497,6 +30933,7 @@
         <w:rPr>
           <w:rFonts w:ascii="Times New Roman" w:hAnsi="Times New Roman"/>
         </w:rPr>
+        <w:lastRenderedPageBreak/>
         <w:t>… weights, angles and spectra repeated for NGEOM spectra in total.</w:t>
       </w:r>
     </w:p>
@@ -30720,7 +31157,6 @@
         <w:rPr>
           <w:rFonts w:ascii="Times New Roman" w:hAnsi="Times New Roman"/>
         </w:rPr>
-        <w:lastRenderedPageBreak/>
         <w:t>NAV</w:t>
       </w:r>
       <w:r>
@@ -31196,6 +31632,7 @@
           <w:rFonts w:ascii="Times New Roman" w:hAnsi="Times New Roman"/>
           <w:noProof/>
         </w:rPr>
+        <w:lastRenderedPageBreak/>
         <w:drawing>
           <wp:inline distT="0" distB="0" distL="0" distR="0" wp14:anchorId="363BC331" wp14:editId="3DD5782D">
             <wp:extent cx="3319397" cy="2652718"/>
@@ -31299,7 +31736,6 @@
         <w:rPr>
           <w:rFonts w:ascii="Times New Roman" w:hAnsi="Times New Roman"/>
         </w:rPr>
-        <w:lastRenderedPageBreak/>
         <w:t xml:space="preserve">For ISCAT=5 calculations, SOL_ANG is as defined, but the EMISS_ANG variable now contains the height in the atmosphere (km) where the downwards radiance is measured (for Venera Venus flux calculations). </w:t>
       </w:r>
     </w:p>
@@ -32201,14 +32637,7 @@
         <w:rPr>
           <w:rFonts w:ascii="Times New Roman" w:hAnsi="Times New Roman"/>
         </w:rPr>
-        <w:t xml:space="preserve"> file and dust profile file). The following lines then contain the profile heights, fractional cloud cover and identifiers </w:t>
-      </w:r>
-      <w:r>
-        <w:rPr>
-          <w:rFonts w:ascii="Times New Roman" w:hAnsi="Times New Roman"/>
-        </w:rPr>
-        <w:lastRenderedPageBreak/>
-        <w:t xml:space="preserve">as to which cloud particle types contribute to the fractional cloud. Hence, the first few lines of the </w:t>
+        <w:t xml:space="preserve"> file and dust profile file). The following lines then contain the profile heights, fractional cloud cover and identifiers as to which cloud particle types contribute to the fractional cloud. Hence, the first few lines of the </w:t>
       </w:r>
       <w:proofErr w:type="spellStart"/>
       <w:r>
@@ -32936,6 +33365,7 @@
         <w:rPr>
           <w:rFonts w:ascii="Times New Roman" w:hAnsi="Times New Roman"/>
         </w:rPr>
+        <w:lastRenderedPageBreak/>
         <w:t>This file (&lt;</w:t>
       </w:r>
       <w:proofErr w:type="spellStart"/>
@@ -33597,7 +34027,6 @@
         <w:rPr>
           <w:rFonts w:ascii="Times New Roman" w:hAnsi="Times New Roman"/>
         </w:rPr>
-        <w:lastRenderedPageBreak/>
         <w:tab/>
       </w:r>
       <w:r>
@@ -34254,6 +34683,7 @@
               <w:rPr>
                 <w:rFonts w:ascii="Times New Roman" w:hAnsi="Times New Roman"/>
               </w:rPr>
+              <w:lastRenderedPageBreak/>
               <w:t>1</w:t>
             </w:r>
           </w:p>
@@ -35023,7 +35453,6 @@
           <w:rFonts w:ascii="Times New Roman" w:hAnsi="Times New Roman"/>
           <w:b/>
         </w:rPr>
-        <w:lastRenderedPageBreak/>
         <w:t>3.10</w:t>
       </w:r>
       <w:r>
@@ -35682,6 +36111,7 @@
           <w:szCs w:val="24"/>
           <w:lang w:val="en-US"/>
         </w:rPr>
+        <w:lastRenderedPageBreak/>
         <w:t>N.B. T</w:t>
       </w:r>
       <w:r>
@@ -36281,16 +36711,7 @@
           <w:szCs w:val="24"/>
           <w:lang w:val="en-US"/>
         </w:rPr>
-        <w:t xml:space="preserve">all wavelengths of IRANK&lt;=MAXIRANK are </w:t>
-      </w:r>
-      <w:r>
-        <w:rPr>
-          <w:rFonts w:ascii="Times New Roman" w:hAnsi="Times New Roman"/>
-          <w:szCs w:val="24"/>
-          <w:lang w:val="en-US"/>
-        </w:rPr>
-        <w:lastRenderedPageBreak/>
-        <w:t>included. Once convergence is achieved with wavelengths of IRANK&lt;=MAXIRANK, the retrieval ends.</w:t>
+        <w:t>all wavelengths of IRANK&lt;=MAXIRANK are included. Once convergence is achieved with wavelengths of IRANK&lt;=MAXIRANK, the retrieval ends.</w:t>
       </w:r>
     </w:p>
     <w:p>
@@ -37056,6 +37477,7 @@
         <w:rPr>
           <w:rFonts w:ascii="Courier New" w:hAnsi="Courier New" w:cs="Courier New"/>
         </w:rPr>
+        <w:lastRenderedPageBreak/>
         <w:t>calc_nlte_t.f</w:t>
       </w:r>
       <w:proofErr w:type="spellEnd"/>
@@ -38074,7 +38496,6 @@
               <w:rPr>
                 <w:rFonts w:ascii="Times New Roman" w:hAnsi="Times New Roman"/>
               </w:rPr>
-              <w:lastRenderedPageBreak/>
               <w:t>2</w:t>
             </w:r>
           </w:p>
@@ -38192,6 +38613,7 @@
               <w:rPr>
                 <w:rFonts w:ascii="Times New Roman" w:hAnsi="Times New Roman"/>
               </w:rPr>
+              <w:lastRenderedPageBreak/>
               <w:t>f = p*1.0e6 / (1.0 + p*1.0e6)</w:t>
             </w:r>
           </w:p>
@@ -38605,14 +39027,7 @@
         <w:rPr>
           <w:rFonts w:ascii="Times New Roman" w:hAnsi="Times New Roman"/>
         </w:rPr>
-        <w:t xml:space="preserve">The second line contains the LBL </w:t>
-      </w:r>
-      <w:r>
-        <w:rPr>
-          <w:rFonts w:ascii="Times New Roman" w:hAnsi="Times New Roman"/>
-        </w:rPr>
-        <w:lastRenderedPageBreak/>
-        <w:t xml:space="preserve">parameters: WING, VREL and VCUTOFF. These are described more fully in the accompanying </w:t>
+        <w:t xml:space="preserve">The second line contains the LBL parameters: WING, VREL and VCUTOFF. These are described more fully in the accompanying </w:t>
       </w:r>
       <w:proofErr w:type="spellStart"/>
       <w:r>
@@ -39708,14 +40123,7 @@
         <w:rPr>
           <w:rFonts w:ascii="Times New Roman" w:hAnsi="Times New Roman"/>
         </w:rPr>
-        <w:t xml:space="preserve">(please contact P. Irwin for </w:t>
-      </w:r>
-      <w:r>
-        <w:rPr>
-          <w:rFonts w:ascii="Times New Roman" w:hAnsi="Times New Roman"/>
-        </w:rPr>
-        <w:lastRenderedPageBreak/>
-        <w:t xml:space="preserve">details on how to access the files). Please see the </w:t>
+        <w:t xml:space="preserve">(please contact P. Irwin for details on how to access the files). Please see the </w:t>
       </w:r>
       <w:proofErr w:type="spellStart"/>
       <w:r>
@@ -40104,6 +40512,7 @@
         <w:rPr>
           <w:rFonts w:ascii="Copperplate" w:hAnsi="Copperplate"/>
         </w:rPr>
+        <w:lastRenderedPageBreak/>
         <w:t>Nemesis</w:t>
       </w:r>
       <w:r>
@@ -40357,7 +40766,6 @@
         <w:rPr>
           <w:rFonts w:ascii="Times New Roman" w:hAnsi="Times New Roman"/>
         </w:rPr>
-        <w:lastRenderedPageBreak/>
         <w:t>The transmission</w:t>
       </w:r>
       <w:r>
@@ -40816,6 +41224,7 @@
         <w:rPr>
           <w:rFonts w:ascii="Copperplate Gothic Light" w:hAnsi="Copperplate Gothic Light"/>
         </w:rPr>
+        <w:lastRenderedPageBreak/>
         <w:t>N</w:t>
       </w:r>
       <w:r>
@@ -41341,7 +41750,6 @@
         <w:rPr>
           <w:rFonts w:ascii="Times New Roman" w:hAnsi="Times New Roman"/>
         </w:rPr>
-        <w:lastRenderedPageBreak/>
         <w:t>11</w:t>
       </w:r>
       <w:r>
@@ -50435,7 +50843,7 @@
 </file>
 
 <file path=customXml/itemProps1.xml><?xml version="1.0" encoding="utf-8"?>
-<ds:datastoreItem xmlns:ds="http://schemas.openxmlformats.org/officeDocument/2006/customXml" ds:itemID="{7C58F384-5FFD-2B4B-9AC9-24BC2A8C61F7}">
+<ds:datastoreItem xmlns:ds="http://schemas.openxmlformats.org/officeDocument/2006/customXml" ds:itemID="{AAA29315-6B41-884F-BB4D-A1F80E4B7350}">
   <ds:schemaRefs>
     <ds:schemaRef ds:uri="http://schemas.openxmlformats.org/officeDocument/2006/bibliography"/>
   </ds:schemaRefs>
@@ -50443,7 +50851,7 @@
 </file>
 
 <file path=customXml/itemProps2.xml><?xml version="1.0" encoding="utf-8"?>
-<ds:datastoreItem xmlns:ds="http://schemas.openxmlformats.org/officeDocument/2006/customXml" ds:itemID="{AAA29315-6B41-884F-BB4D-A1F80E4B7350}">
+<ds:datastoreItem xmlns:ds="http://schemas.openxmlformats.org/officeDocument/2006/customXml" ds:itemID="{7C58F384-5FFD-2B4B-9AC9-24BC2A8C61F7}">
   <ds:schemaRefs>
     <ds:schemaRef ds:uri="http://schemas.openxmlformats.org/officeDocument/2006/bibliography"/>
   </ds:schemaRefs>

</xml_diff>

<commit_message>
Added models 63 and 64
</commit_message>
<xml_diff>
--- a/manuals/Nemesis_3.0.docx
+++ b/manuals/Nemesis_3.0.docx
@@ -27879,13 +27879,7 @@
         <w:rPr>
           <w:rFonts w:ascii="Times New Roman" w:hAnsi="Times New Roman"/>
         </w:rPr>
-        <w:t>maximum specific density</w:t>
-      </w:r>
-      <w:r>
-        <w:rPr>
-          <w:rFonts w:ascii="Times New Roman" w:hAnsi="Times New Roman"/>
-        </w:rPr>
-        <w:t xml:space="preserve"> at an upper pressure level, the </w:t>
+        <w:t xml:space="preserve">maximum specific density at an upper pressure level, the </w:t>
       </w:r>
       <w:proofErr w:type="spellStart"/>
       <w:r>
@@ -28108,21 +28102,7 @@
           <w:rFonts w:ascii="Times New Roman" w:hAnsi="Times New Roman"/>
           <w:color w:val="000000"/>
         </w:rPr>
-        <w:t>, middle gas abundance (above a fixed pressure level)</w:t>
-      </w:r>
-      <w:r>
-        <w:rPr>
-          <w:rFonts w:ascii="Times New Roman" w:hAnsi="Times New Roman"/>
-          <w:color w:val="000000"/>
-        </w:rPr>
-        <w:t xml:space="preserve">, desired </w:t>
-      </w:r>
-      <w:r>
-        <w:rPr>
-          <w:rFonts w:ascii="Times New Roman" w:hAnsi="Times New Roman"/>
-          <w:color w:val="000000"/>
-        </w:rPr>
-        <w:t xml:space="preserve">maximum </w:t>
+        <w:t xml:space="preserve">, middle gas abundance (above a fixed pressure level), desired maximum </w:t>
       </w:r>
       <w:r>
         <w:rPr>
@@ -28136,14 +28116,445 @@
           <w:rFonts w:ascii="Times New Roman" w:hAnsi="Times New Roman"/>
           <w:color w:val="000000"/>
         </w:rPr>
-        <w:t xml:space="preserve"> humidity</w:t>
-      </w:r>
-      <w:r>
-        <w:rPr>
-          <w:rFonts w:ascii="Times New Roman" w:hAnsi="Times New Roman"/>
-          <w:color w:val="000000"/>
-        </w:rPr>
-        <w:t xml:space="preserve"> after condensation, and then rate of fall-off of RH above that level.</w:t>
+        <w:t xml:space="preserve"> humidity after condensation, and then rate of fall-off of RH above that level. The next lines of the .</w:t>
+      </w:r>
+      <w:proofErr w:type="spellStart"/>
+      <w:r>
+        <w:rPr>
+          <w:rFonts w:ascii="Times New Roman" w:hAnsi="Times New Roman"/>
+          <w:color w:val="000000"/>
+        </w:rPr>
+        <w:t>apr</w:t>
+      </w:r>
+      <w:proofErr w:type="spellEnd"/>
+      <w:r>
+        <w:rPr>
+          <w:rFonts w:ascii="Times New Roman" w:hAnsi="Times New Roman"/>
+          <w:color w:val="000000"/>
+        </w:rPr>
+        <w:t xml:space="preserve"> file then contain: 1) the </w:t>
+      </w:r>
+      <w:r>
+        <w:rPr>
+          <w:rFonts w:ascii="Times New Roman" w:hAnsi="Times New Roman"/>
+          <w:i/>
+          <w:color w:val="000000"/>
+        </w:rPr>
+        <w:t>a priori</w:t>
+      </w:r>
+      <w:r>
+        <w:rPr>
+          <w:rFonts w:ascii="Times New Roman" w:hAnsi="Times New Roman"/>
+          <w:color w:val="000000"/>
+        </w:rPr>
+        <w:t xml:space="preserve"> </w:t>
+      </w:r>
+      <w:r>
+        <w:rPr>
+          <w:rFonts w:ascii="Times New Roman" w:hAnsi="Times New Roman"/>
+          <w:color w:val="000000"/>
+        </w:rPr>
+        <w:t xml:space="preserve">deep abundance and error; </w:t>
+      </w:r>
+      <w:r>
+        <w:rPr>
+          <w:rFonts w:ascii="Times New Roman" w:hAnsi="Times New Roman"/>
+          <w:color w:val="000000"/>
+        </w:rPr>
+        <w:t>2</w:t>
+      </w:r>
+      <w:r>
+        <w:rPr>
+          <w:rFonts w:ascii="Times New Roman" w:hAnsi="Times New Roman"/>
+          <w:color w:val="000000"/>
+        </w:rPr>
+        <w:t xml:space="preserve">) the </w:t>
+      </w:r>
+      <w:r>
+        <w:rPr>
+          <w:rFonts w:ascii="Times New Roman" w:hAnsi="Times New Roman"/>
+          <w:i/>
+          <w:color w:val="000000"/>
+        </w:rPr>
+        <w:t>a priori</w:t>
+      </w:r>
+      <w:r>
+        <w:rPr>
+          <w:rFonts w:ascii="Times New Roman" w:hAnsi="Times New Roman"/>
+          <w:color w:val="000000"/>
+        </w:rPr>
+        <w:t xml:space="preserve"> </w:t>
+      </w:r>
+      <w:r>
+        <w:rPr>
+          <w:rFonts w:ascii="Times New Roman" w:hAnsi="Times New Roman"/>
+          <w:color w:val="000000"/>
+        </w:rPr>
+        <w:t xml:space="preserve">middle abundance and error; 3) the </w:t>
+      </w:r>
+      <w:r>
+        <w:rPr>
+          <w:rFonts w:ascii="Times New Roman" w:hAnsi="Times New Roman"/>
+          <w:i/>
+          <w:color w:val="000000"/>
+        </w:rPr>
+        <w:t>a priori</w:t>
+      </w:r>
+      <w:r>
+        <w:rPr>
+          <w:rFonts w:ascii="Times New Roman" w:hAnsi="Times New Roman"/>
+          <w:color w:val="000000"/>
+        </w:rPr>
+        <w:t xml:space="preserve"> </w:t>
+      </w:r>
+      <w:r>
+        <w:rPr>
+          <w:rFonts w:ascii="Times New Roman" w:hAnsi="Times New Roman"/>
+          <w:color w:val="000000"/>
+        </w:rPr>
+        <w:t xml:space="preserve">relative humidity (RH) and error; 4) the </w:t>
+      </w:r>
+      <w:r>
+        <w:rPr>
+          <w:rFonts w:ascii="Times New Roman" w:hAnsi="Times New Roman"/>
+          <w:color w:val="000000"/>
+        </w:rPr>
+        <w:t xml:space="preserve">scale height of the </w:t>
+      </w:r>
+      <w:r>
+        <w:rPr>
+          <w:rFonts w:ascii="Times New Roman" w:hAnsi="Times New Roman"/>
+          <w:color w:val="000000"/>
+        </w:rPr>
+        <w:t>RH</w:t>
+      </w:r>
+      <w:r>
+        <w:rPr>
+          <w:rFonts w:ascii="Times New Roman" w:hAnsi="Times New Roman"/>
+          <w:color w:val="000000"/>
+        </w:rPr>
+        <w:t xml:space="preserve"> above the condensation level</w:t>
+      </w:r>
+      <w:r>
+        <w:rPr>
+          <w:rFonts w:ascii="Times New Roman" w:hAnsi="Times New Roman"/>
+          <w:color w:val="000000"/>
+        </w:rPr>
+        <w:t>; and 5) the fixed pressure level.</w:t>
+      </w:r>
+    </w:p>
+    <w:p>
+      <w:pPr>
+        <w:ind w:left="709"/>
+        <w:jc w:val="both"/>
+        <w:rPr>
+          <w:rFonts w:ascii="Times New Roman" w:hAnsi="Times New Roman"/>
+        </w:rPr>
+      </w:pPr>
+    </w:p>
+    <w:p>
+      <w:pPr>
+        <w:numPr>
+          <w:ilvl w:val="0"/>
+          <w:numId w:val="18"/>
+        </w:numPr>
+        <w:ind w:left="709" w:hanging="425"/>
+        <w:jc w:val="both"/>
+        <w:rPr>
+          <w:rFonts w:ascii="Times New Roman" w:hAnsi="Times New Roman"/>
+        </w:rPr>
+      </w:pPr>
+      <w:r>
+        <w:rPr>
+          <w:rFonts w:ascii="Times New Roman" w:hAnsi="Times New Roman"/>
+        </w:rPr>
+        <w:t xml:space="preserve">Like model </w:t>
+      </w:r>
+      <w:r>
+        <w:rPr>
+          <w:rFonts w:ascii="Times New Roman" w:hAnsi="Times New Roman"/>
+        </w:rPr>
+        <w:t>62, but also condenses a cloud</w:t>
+      </w:r>
+      <w:r>
+        <w:rPr>
+          <w:rFonts w:ascii="Times New Roman" w:hAnsi="Times New Roman"/>
+        </w:rPr>
+        <w:t xml:space="preserve">. </w:t>
+      </w:r>
+      <w:r>
+        <w:rPr>
+          <w:rFonts w:ascii="Times New Roman" w:hAnsi="Times New Roman"/>
+          <w:color w:val="000000"/>
+        </w:rPr>
+        <w:t xml:space="preserve">Model requires the deep gas abundance, middle gas abundance (above a fixed pressure level), desired maximum relative humidity after condensation, and then rate of fall-off of RH above that level. </w:t>
+      </w:r>
+      <w:r>
+        <w:rPr>
+          <w:rFonts w:ascii="Times New Roman" w:hAnsi="Times New Roman"/>
+          <w:color w:val="000000"/>
+        </w:rPr>
+        <w:t xml:space="preserve">Then we have the opacity of the associated cloud and the </w:t>
+      </w:r>
+      <w:proofErr w:type="spellStart"/>
+      <w:r>
+        <w:rPr>
+          <w:rFonts w:ascii="Times New Roman" w:hAnsi="Times New Roman"/>
+          <w:color w:val="000000"/>
+        </w:rPr>
+        <w:t>fsh</w:t>
+      </w:r>
+      <w:proofErr w:type="spellEnd"/>
+      <w:r>
+        <w:rPr>
+          <w:rFonts w:ascii="Times New Roman" w:hAnsi="Times New Roman"/>
+          <w:color w:val="000000"/>
+        </w:rPr>
+        <w:t xml:space="preserve"> of that cloud above the condensation level</w:t>
+      </w:r>
+      <w:r>
+        <w:rPr>
+          <w:rFonts w:ascii="Times New Roman" w:hAnsi="Times New Roman"/>
+          <w:color w:val="000000"/>
+        </w:rPr>
+        <w:t>, and various fixed parameters.</w:t>
+      </w:r>
+      <w:r>
+        <w:rPr>
+          <w:rFonts w:ascii="Times New Roman" w:hAnsi="Times New Roman"/>
+          <w:color w:val="000000"/>
+        </w:rPr>
+        <w:t xml:space="preserve"> </w:t>
+      </w:r>
+      <w:r>
+        <w:rPr>
+          <w:rFonts w:ascii="Times New Roman" w:hAnsi="Times New Roman"/>
+          <w:color w:val="000000"/>
+        </w:rPr>
+        <w:t>The next lines of the .</w:t>
+      </w:r>
+      <w:proofErr w:type="spellStart"/>
+      <w:r>
+        <w:rPr>
+          <w:rFonts w:ascii="Times New Roman" w:hAnsi="Times New Roman"/>
+          <w:color w:val="000000"/>
+        </w:rPr>
+        <w:t>apr</w:t>
+      </w:r>
+      <w:proofErr w:type="spellEnd"/>
+      <w:r>
+        <w:rPr>
+          <w:rFonts w:ascii="Times New Roman" w:hAnsi="Times New Roman"/>
+          <w:color w:val="000000"/>
+        </w:rPr>
+        <w:t xml:space="preserve"> file contain: 1) the </w:t>
+      </w:r>
+      <w:r>
+        <w:rPr>
+          <w:rFonts w:ascii="Times New Roman" w:hAnsi="Times New Roman"/>
+          <w:i/>
+          <w:color w:val="000000"/>
+        </w:rPr>
+        <w:t>a priori</w:t>
+      </w:r>
+      <w:r>
+        <w:rPr>
+          <w:rFonts w:ascii="Times New Roman" w:hAnsi="Times New Roman"/>
+          <w:color w:val="000000"/>
+        </w:rPr>
+        <w:t xml:space="preserve"> deep abundance and error; </w:t>
+      </w:r>
+      <w:r>
+        <w:rPr>
+          <w:rFonts w:ascii="Times New Roman" w:hAnsi="Times New Roman"/>
+          <w:color w:val="000000"/>
+        </w:rPr>
+        <w:t>2</w:t>
+      </w:r>
+      <w:r>
+        <w:rPr>
+          <w:rFonts w:ascii="Times New Roman" w:hAnsi="Times New Roman"/>
+          <w:color w:val="000000"/>
+        </w:rPr>
+        <w:t xml:space="preserve">) the </w:t>
+      </w:r>
+      <w:r>
+        <w:rPr>
+          <w:rFonts w:ascii="Times New Roman" w:hAnsi="Times New Roman"/>
+          <w:i/>
+          <w:color w:val="000000"/>
+        </w:rPr>
+        <w:t>a priori</w:t>
+      </w:r>
+      <w:r>
+        <w:rPr>
+          <w:rFonts w:ascii="Times New Roman" w:hAnsi="Times New Roman"/>
+          <w:color w:val="000000"/>
+        </w:rPr>
+        <w:t xml:space="preserve"> middle abundance and error; </w:t>
+      </w:r>
+      <w:r>
+        <w:rPr>
+          <w:rFonts w:ascii="Times New Roman" w:hAnsi="Times New Roman"/>
+          <w:color w:val="000000"/>
+        </w:rPr>
+        <w:t>3</w:t>
+      </w:r>
+      <w:proofErr w:type="gramStart"/>
+      <w:r>
+        <w:rPr>
+          <w:rFonts w:ascii="Times New Roman" w:hAnsi="Times New Roman"/>
+          <w:color w:val="000000"/>
+        </w:rPr>
+        <w:t>)</w:t>
+      </w:r>
+      <w:r>
+        <w:rPr>
+          <w:rFonts w:ascii="Times New Roman" w:hAnsi="Times New Roman"/>
+          <w:color w:val="000000"/>
+        </w:rPr>
+        <w:t xml:space="preserve"> </w:t>
+      </w:r>
+      <w:r>
+        <w:rPr>
+          <w:rFonts w:ascii="Times New Roman" w:hAnsi="Times New Roman"/>
+          <w:color w:val="000000"/>
+        </w:rPr>
+        <w:t xml:space="preserve"> the</w:t>
+      </w:r>
+      <w:proofErr w:type="gramEnd"/>
+      <w:r>
+        <w:rPr>
+          <w:rFonts w:ascii="Times New Roman" w:hAnsi="Times New Roman"/>
+          <w:color w:val="000000"/>
+        </w:rPr>
+        <w:t xml:space="preserve"> </w:t>
+      </w:r>
+      <w:r>
+        <w:rPr>
+          <w:rFonts w:ascii="Times New Roman" w:hAnsi="Times New Roman"/>
+          <w:i/>
+          <w:color w:val="000000"/>
+        </w:rPr>
+        <w:t>a priori</w:t>
+      </w:r>
+      <w:r>
+        <w:rPr>
+          <w:rFonts w:ascii="Times New Roman" w:hAnsi="Times New Roman"/>
+          <w:color w:val="000000"/>
+        </w:rPr>
+        <w:t xml:space="preserve"> relative humidity (RH) and error; 4) the scale height of the RH above the condensation level</w:t>
+      </w:r>
+      <w:r>
+        <w:rPr>
+          <w:rFonts w:ascii="Times New Roman" w:hAnsi="Times New Roman"/>
+          <w:color w:val="000000"/>
+        </w:rPr>
+        <w:t xml:space="preserve"> and error</w:t>
+      </w:r>
+      <w:r>
+        <w:rPr>
+          <w:rFonts w:ascii="Times New Roman" w:hAnsi="Times New Roman"/>
+          <w:color w:val="000000"/>
+        </w:rPr>
+        <w:t xml:space="preserve">; </w:t>
+      </w:r>
+      <w:r>
+        <w:rPr>
+          <w:rFonts w:ascii="Times New Roman" w:hAnsi="Times New Roman"/>
+          <w:color w:val="000000"/>
+        </w:rPr>
+        <w:t>5</w:t>
+      </w:r>
+      <w:r>
+        <w:rPr>
+          <w:rFonts w:ascii="Times New Roman" w:hAnsi="Times New Roman"/>
+          <w:color w:val="000000"/>
+        </w:rPr>
+        <w:t xml:space="preserve">) </w:t>
+      </w:r>
+      <w:r>
+        <w:rPr>
+          <w:rFonts w:ascii="Times New Roman" w:hAnsi="Times New Roman"/>
+          <w:color w:val="000000"/>
+        </w:rPr>
+        <w:t>the cloud opacity</w:t>
+      </w:r>
+      <w:r>
+        <w:rPr>
+          <w:rFonts w:ascii="Times New Roman" w:hAnsi="Times New Roman"/>
+          <w:color w:val="000000"/>
+        </w:rPr>
+        <w:t xml:space="preserve"> and error</w:t>
+      </w:r>
+      <w:r>
+        <w:rPr>
+          <w:rFonts w:ascii="Times New Roman" w:hAnsi="Times New Roman"/>
+          <w:color w:val="000000"/>
+        </w:rPr>
+        <w:t>; 6) the cloud scale height</w:t>
+      </w:r>
+      <w:r>
+        <w:rPr>
+          <w:rFonts w:ascii="Times New Roman" w:hAnsi="Times New Roman"/>
+          <w:color w:val="000000"/>
+        </w:rPr>
+        <w:t xml:space="preserve"> and error. Then we have PKNEE and ICONT (i.e., pressure of deep step, and ID of condensing cloud), and finally we have PHAZE and WHAZE which reduced the cloud opacity to zero at levels above PHAZE, with a gaussian cut-off width of WHAZE.</w:t>
+      </w:r>
+      <w:r>
+        <w:rPr>
+          <w:rFonts w:ascii="Times New Roman" w:hAnsi="Times New Roman"/>
+          <w:color w:val="000000"/>
+        </w:rPr>
+        <w:t xml:space="preserve"> </w:t>
+      </w:r>
+    </w:p>
+    <w:p>
+      <w:pPr>
+        <w:tabs>
+          <w:tab w:val="left" w:pos="284"/>
+        </w:tabs>
+        <w:jc w:val="both"/>
+        <w:rPr>
+          <w:rFonts w:ascii="Times New Roman" w:hAnsi="Times New Roman"/>
+        </w:rPr>
+      </w:pPr>
+    </w:p>
+    <w:p>
+      <w:pPr>
+        <w:numPr>
+          <w:ilvl w:val="0"/>
+          <w:numId w:val="18"/>
+        </w:numPr>
+        <w:ind w:left="709" w:hanging="425"/>
+        <w:jc w:val="both"/>
+        <w:rPr>
+          <w:rFonts w:ascii="Times New Roman" w:hAnsi="Times New Roman"/>
+        </w:rPr>
+      </w:pPr>
+      <w:r>
+        <w:rPr>
+          <w:rFonts w:ascii="Times New Roman" w:hAnsi="Times New Roman"/>
+        </w:rPr>
+        <w:t>Like model 6</w:t>
+      </w:r>
+      <w:r>
+        <w:rPr>
+          <w:rFonts w:ascii="Times New Roman" w:hAnsi="Times New Roman"/>
+        </w:rPr>
+        <w:t>3</w:t>
+      </w:r>
+      <w:r>
+        <w:rPr>
+          <w:rFonts w:ascii="Times New Roman" w:hAnsi="Times New Roman"/>
+        </w:rPr>
+        <w:t xml:space="preserve">, </w:t>
+      </w:r>
+      <w:r>
+        <w:rPr>
+          <w:rFonts w:ascii="Times New Roman" w:hAnsi="Times New Roman"/>
+        </w:rPr>
+        <w:t>but the gas abundance between PKNEE and PCOND can fall with height.</w:t>
       </w:r>
       <w:r>
         <w:rPr>
@@ -28166,7 +28577,7 @@
           <w:rFonts w:ascii="Times New Roman" w:hAnsi="Times New Roman"/>
           <w:color w:val="000000"/>
         </w:rPr>
-        <w:t xml:space="preserve"> file then contain: 1) the </w:t>
+        <w:t xml:space="preserve"> file contain: 1) the </w:t>
       </w:r>
       <w:r>
         <w:rPr>
@@ -28181,6 +28592,35 @@
           <w:rFonts w:ascii="Times New Roman" w:hAnsi="Times New Roman"/>
           <w:color w:val="000000"/>
         </w:rPr>
+        <w:t xml:space="preserve"> deep abundance and error; 2) the </w:t>
+      </w:r>
+      <w:r>
+        <w:rPr>
+          <w:rFonts w:ascii="Times New Roman" w:hAnsi="Times New Roman"/>
+          <w:i/>
+          <w:color w:val="000000"/>
+        </w:rPr>
+        <w:t>a priori</w:t>
+      </w:r>
+      <w:r>
+        <w:rPr>
+          <w:rFonts w:ascii="Times New Roman" w:hAnsi="Times New Roman"/>
+          <w:color w:val="000000"/>
+        </w:rPr>
+        <w:t xml:space="preserve"> middle abundance and error; 3) </w:t>
+      </w:r>
+      <w:r>
+        <w:rPr>
+          <w:rFonts w:ascii="Times New Roman" w:hAnsi="Times New Roman"/>
+          <w:color w:val="000000"/>
+        </w:rPr>
+        <w:t>the fractional scale height of above PKNEE and error;</w:t>
+      </w:r>
+      <w:r>
+        <w:rPr>
+          <w:rFonts w:ascii="Times New Roman" w:hAnsi="Times New Roman"/>
+          <w:color w:val="000000"/>
+        </w:rPr>
         <w:t xml:space="preserve"> </w:t>
       </w:r>
       <w:r>
@@ -28188,7 +28628,14 @@
           <w:rFonts w:ascii="Times New Roman" w:hAnsi="Times New Roman"/>
           <w:color w:val="000000"/>
         </w:rPr>
-        <w:t xml:space="preserve">deep abundance and error; 1) the </w:t>
+        <w:t>4</w:t>
+      </w:r>
+      <w:r>
+        <w:rPr>
+          <w:rFonts w:ascii="Times New Roman" w:hAnsi="Times New Roman"/>
+          <w:color w:val="000000"/>
+        </w:rPr>
+        <w:t xml:space="preserve">) the </w:t>
       </w:r>
       <w:r>
         <w:rPr>
@@ -28203,102 +28650,50 @@
           <w:rFonts w:ascii="Times New Roman" w:hAnsi="Times New Roman"/>
           <w:color w:val="000000"/>
         </w:rPr>
-        <w:t xml:space="preserve"> </w:t>
-      </w:r>
-      <w:r>
-        <w:rPr>
-          <w:rFonts w:ascii="Times New Roman" w:hAnsi="Times New Roman"/>
-          <w:color w:val="000000"/>
-        </w:rPr>
-        <w:t xml:space="preserve">middle abundance and error; 3) the </w:t>
-      </w:r>
-      <w:r>
-        <w:rPr>
-          <w:rFonts w:ascii="Times New Roman" w:hAnsi="Times New Roman"/>
-          <w:i/>
-          <w:color w:val="000000"/>
-        </w:rPr>
-        <w:t>a priori</w:t>
-      </w:r>
-      <w:r>
-        <w:rPr>
-          <w:rFonts w:ascii="Times New Roman" w:hAnsi="Times New Roman"/>
-          <w:color w:val="000000"/>
-        </w:rPr>
-        <w:t xml:space="preserve"> </w:t>
-      </w:r>
-      <w:r>
-        <w:rPr>
-          <w:rFonts w:ascii="Times New Roman" w:hAnsi="Times New Roman"/>
-          <w:color w:val="000000"/>
-        </w:rPr>
-        <w:t>relative humidity (RH) and error</w:t>
-      </w:r>
-      <w:r>
-        <w:rPr>
-          <w:rFonts w:ascii="Times New Roman" w:hAnsi="Times New Roman"/>
-          <w:color w:val="000000"/>
-        </w:rPr>
-        <w:t xml:space="preserve">; </w:t>
-      </w:r>
-      <w:r>
-        <w:rPr>
-          <w:rFonts w:ascii="Times New Roman" w:hAnsi="Times New Roman"/>
-          <w:color w:val="000000"/>
-        </w:rPr>
-        <w:t xml:space="preserve">4) </w:t>
-      </w:r>
-      <w:r>
-        <w:rPr>
-          <w:rFonts w:ascii="Times New Roman" w:hAnsi="Times New Roman"/>
-          <w:color w:val="000000"/>
-        </w:rPr>
-        <w:t xml:space="preserve">the </w:t>
-      </w:r>
-      <w:r>
-        <w:rPr>
-          <w:rFonts w:ascii="Times New Roman" w:hAnsi="Times New Roman"/>
-          <w:color w:val="000000"/>
-        </w:rPr>
-        <w:t xml:space="preserve">scale height of the </w:t>
-      </w:r>
-      <w:r>
-        <w:rPr>
-          <w:rFonts w:ascii="Times New Roman" w:hAnsi="Times New Roman"/>
-          <w:color w:val="000000"/>
-        </w:rPr>
-        <w:t>RH</w:t>
-      </w:r>
-      <w:r>
-        <w:rPr>
-          <w:rFonts w:ascii="Times New Roman" w:hAnsi="Times New Roman"/>
-          <w:color w:val="000000"/>
-        </w:rPr>
-        <w:t xml:space="preserve"> above the condensation level</w:t>
-      </w:r>
-      <w:r>
-        <w:rPr>
-          <w:rFonts w:ascii="Times New Roman" w:hAnsi="Times New Roman"/>
-          <w:color w:val="000000"/>
-        </w:rPr>
-        <w:t>; and 5) the fixed pressure level</w:t>
-      </w:r>
-      <w:r>
-        <w:rPr>
-          <w:rFonts w:ascii="Times New Roman" w:hAnsi="Times New Roman"/>
-          <w:color w:val="000000"/>
-        </w:rPr>
-        <w:t>.</w:t>
-      </w:r>
-    </w:p>
-    <w:p>
-      <w:pPr>
-        <w:ind w:left="709"/>
-        <w:jc w:val="both"/>
-        <w:rPr>
-          <w:rFonts w:ascii="Times New Roman" w:hAnsi="Times New Roman"/>
-        </w:rPr>
-      </w:pPr>
+        <w:t xml:space="preserve"> relative humidity (RH) and error; </w:t>
+      </w:r>
+      <w:r>
+        <w:rPr>
+          <w:rFonts w:ascii="Times New Roman" w:hAnsi="Times New Roman"/>
+          <w:color w:val="000000"/>
+        </w:rPr>
+        <w:t>5</w:t>
+      </w:r>
+      <w:r>
+        <w:rPr>
+          <w:rFonts w:ascii="Times New Roman" w:hAnsi="Times New Roman"/>
+          <w:color w:val="000000"/>
+        </w:rPr>
+        <w:t xml:space="preserve">) the scale height of the RH above the condensation level and error; </w:t>
+      </w:r>
+      <w:r>
+        <w:rPr>
+          <w:rFonts w:ascii="Times New Roman" w:hAnsi="Times New Roman"/>
+          <w:color w:val="000000"/>
+        </w:rPr>
+        <w:t>6</w:t>
+      </w:r>
+      <w:r>
+        <w:rPr>
+          <w:rFonts w:ascii="Times New Roman" w:hAnsi="Times New Roman"/>
+          <w:color w:val="000000"/>
+        </w:rPr>
+        <w:t xml:space="preserve">) the cloud opacity and error; </w:t>
+      </w:r>
+      <w:r>
+        <w:rPr>
+          <w:rFonts w:ascii="Times New Roman" w:hAnsi="Times New Roman"/>
+          <w:color w:val="000000"/>
+        </w:rPr>
+        <w:t>7</w:t>
+      </w:r>
+      <w:r>
+        <w:rPr>
+          <w:rFonts w:ascii="Times New Roman" w:hAnsi="Times New Roman"/>
+          <w:color w:val="000000"/>
+        </w:rPr>
+        <w:t xml:space="preserve">) the cloud scale height and error. Then we have PKNEE and ICONT (i.e., pressure of deep step, and ID of condensing cloud), and finally we have PHAZE and WHAZE which reduced the cloud opacity to zero at levels above PHAZE, with a gaussian cut-off width of WHAZE. </w:t>
+      </w:r>
     </w:p>
     <w:p>
       <w:pPr>
@@ -28673,6 +29068,7 @@
         <w:rPr>
           <w:rFonts w:ascii="Times New Roman" w:hAnsi="Times New Roman"/>
         </w:rPr>
+        <w:lastRenderedPageBreak/>
         <w:t>ENAME</w:t>
       </w:r>
     </w:p>
@@ -29677,7 +30073,6 @@
         <w:rPr>
           <w:rFonts w:ascii="Times New Roman" w:hAnsi="Times New Roman"/>
         </w:rPr>
-        <w:lastRenderedPageBreak/>
         <w:t>If LIN is set to 3, then the previous retrievals are read in, and if any variable is the same as one of the variables to be retrieved (as listed in the .</w:t>
       </w:r>
       <w:proofErr w:type="spellStart"/>
@@ -30029,6 +30424,7 @@
         <w:rPr>
           <w:rFonts w:ascii="Times New Roman" w:hAnsi="Times New Roman"/>
         </w:rPr>
+        <w:lastRenderedPageBreak/>
         <w:t>NAV(</w:t>
       </w:r>
       <w:proofErr w:type="gramEnd"/>
@@ -30933,7 +31329,6 @@
         <w:rPr>
           <w:rFonts w:ascii="Times New Roman" w:hAnsi="Times New Roman"/>
         </w:rPr>
-        <w:lastRenderedPageBreak/>
         <w:t>… weights, angles and spectra repeated for NGEOM spectra in total.</w:t>
       </w:r>
     </w:p>
@@ -31199,7 +31594,14 @@
         <w:rPr>
           <w:rFonts w:ascii="Times New Roman" w:hAnsi="Times New Roman"/>
         </w:rPr>
-        <w:t xml:space="preserve">. NAV specifies how many individual spectra need to be calculated and averaged to simulate the measured field-of-view-averaged spectrum. The next NAV lines contain the integration point latitudes (FLAT), longitudes (FLON), viewing angles (SOL_ANG, EMISS_ANG, AZI_ANG) and weights (WGEOM). The angle definitions are outlined in Figure 1. Following this, there then follows the actual measured wavelengths/wavenumbers, spectrum and errors (all of length NCONV) which are read in and put in total measurement vector </w:t>
+        <w:t xml:space="preserve">. NAV specifies how many individual spectra need to be calculated and averaged to simulate </w:t>
+      </w:r>
+      <w:r>
+        <w:rPr>
+          <w:rFonts w:ascii="Times New Roman" w:hAnsi="Times New Roman"/>
+        </w:rPr>
+        <w:lastRenderedPageBreak/>
+        <w:t xml:space="preserve">the measured field-of-view-averaged spectrum. The next NAV lines contain the integration point latitudes (FLAT), longitudes (FLON), viewing angles (SOL_ANG, EMISS_ANG, AZI_ANG) and weights (WGEOM). The angle definitions are outlined in Figure 1. Following this, there then follows the actual measured wavelengths/wavenumbers, spectrum and errors (all of length NCONV) which are read in and put in total measurement vector </w:t>
       </w:r>
       <w:r>
         <w:rPr>
@@ -31632,7 +32034,6 @@
           <w:rFonts w:ascii="Times New Roman" w:hAnsi="Times New Roman"/>
           <w:noProof/>
         </w:rPr>
-        <w:lastRenderedPageBreak/>
         <w:drawing>
           <wp:inline distT="0" distB="0" distL="0" distR="0" wp14:anchorId="363BC331" wp14:editId="3DD5782D">
             <wp:extent cx="3319397" cy="2652718"/>
@@ -33365,7 +33766,6 @@
         <w:rPr>
           <w:rFonts w:ascii="Times New Roman" w:hAnsi="Times New Roman"/>
         </w:rPr>
-        <w:lastRenderedPageBreak/>
         <w:t>This file (&lt;</w:t>
       </w:r>
       <w:proofErr w:type="spellStart"/>
@@ -34216,6 +34616,7 @@
         <w:rPr>
           <w:rFonts w:ascii="Times New Roman" w:hAnsi="Times New Roman"/>
         </w:rPr>
+        <w:lastRenderedPageBreak/>
         <w:t>IH2O</w:t>
       </w:r>
       <w:r>
@@ -34683,7 +35084,6 @@
               <w:rPr>
                 <w:rFonts w:ascii="Times New Roman" w:hAnsi="Times New Roman"/>
               </w:rPr>
-              <w:lastRenderedPageBreak/>
               <w:t>1</w:t>
             </w:r>
           </w:p>
@@ -35568,6 +35968,7 @@
         <w:rPr>
           <w:rFonts w:ascii="Times New Roman" w:hAnsi="Times New Roman"/>
         </w:rPr>
+        <w:lastRenderedPageBreak/>
         <w:t xml:space="preserve">The first line of the file gives the number of gases, NVP, whose abundances are to be limited by condensation. There then flow NVP lines, each listing: </w:t>
       </w:r>
     </w:p>
@@ -36111,7 +36512,6 @@
           <w:szCs w:val="24"/>
           <w:lang w:val="en-US"/>
         </w:rPr>
-        <w:lastRenderedPageBreak/>
         <w:t>N.B. T</w:t>
       </w:r>
       <w:r>
@@ -36919,6 +37319,7 @@
           <w:szCs w:val="24"/>
           <w:lang w:val="en-US"/>
         </w:rPr>
+        <w:lastRenderedPageBreak/>
         <w:t>#Leave a blank line below the last comment</w:t>
       </w:r>
     </w:p>
@@ -37477,7 +37878,6 @@
         <w:rPr>
           <w:rFonts w:ascii="Courier New" w:hAnsi="Courier New" w:cs="Courier New"/>
         </w:rPr>
-        <w:lastRenderedPageBreak/>
         <w:t>calc_nlte_t.f</w:t>
       </w:r>
       <w:proofErr w:type="spellEnd"/>
@@ -38496,6 +38896,7 @@
               <w:rPr>
                 <w:rFonts w:ascii="Times New Roman" w:hAnsi="Times New Roman"/>
               </w:rPr>
+              <w:lastRenderedPageBreak/>
               <w:t>2</w:t>
             </w:r>
           </w:p>
@@ -38613,7 +39014,6 @@
               <w:rPr>
                 <w:rFonts w:ascii="Times New Roman" w:hAnsi="Times New Roman"/>
               </w:rPr>
-              <w:lastRenderedPageBreak/>
               <w:t>f = p*1.0e6 / (1.0 + p*1.0e6)</w:t>
             </w:r>
           </w:p>
@@ -39061,7 +39461,14 @@
         <w:rPr>
           <w:rFonts w:ascii="Times New Roman" w:hAnsi="Times New Roman"/>
         </w:rPr>
-        <w:t xml:space="preserve"> to contribute such that all the lines in the range VMIN-VREL to VMAX+VREL are included. Finally, VCUTOFF limits the contribution of any line past the specified distance from the line centres. This simulates the sub-</w:t>
+        <w:t xml:space="preserve"> to contribute such that all the lines in the range VMIN-VREL to VMAX+VREL are included. Finally, VCUTOFF limits the contribution of any line past the specified distance from </w:t>
+      </w:r>
+      <w:r>
+        <w:rPr>
+          <w:rFonts w:ascii="Times New Roman" w:hAnsi="Times New Roman"/>
+        </w:rPr>
+        <w:lastRenderedPageBreak/>
+        <w:t>the line centres. This simulates the sub-</w:t>
       </w:r>
       <w:proofErr w:type="spellStart"/>
       <w:r>
@@ -40512,7 +40919,6 @@
         <w:rPr>
           <w:rFonts w:ascii="Copperplate" w:hAnsi="Copperplate"/>
         </w:rPr>
-        <w:lastRenderedPageBreak/>
         <w:t>Nemesis</w:t>
       </w:r>
       <w:r>
@@ -40895,6 +41301,7 @@
         <w:rPr>
           <w:rFonts w:ascii="Times New Roman" w:hAnsi="Times New Roman"/>
         </w:rPr>
+        <w:lastRenderedPageBreak/>
         <w:t>For most cases the Jacobeans can be calculated analytically, for which INUM=0. However, when trying to retrieve temperature and pressure together, the effects of varying each changes the atmospheric profile in a complicated and non-linear way. Hence, these Jacobeans have to be calculated by numerical differencing, set by INUM=1.</w:t>
       </w:r>
     </w:p>
@@ -41224,7 +41631,6 @@
         <w:rPr>
           <w:rFonts w:ascii="Copperplate Gothic Light" w:hAnsi="Copperplate Gothic Light"/>
         </w:rPr>
-        <w:lastRenderedPageBreak/>
         <w:t>N</w:t>
       </w:r>
       <w:r>
@@ -41870,7 +42276,14 @@
         <w:rPr>
           <w:rFonts w:ascii="Times New Roman" w:hAnsi="Times New Roman"/>
         </w:rPr>
-        <w:t xml:space="preserve"> is an ASCII file containing the computed spectra for each path defined in the .pat file. Two spectra are output per path, one which is the raw spectrum calculated at the k-table wavelengths/wavenumbers spanning the requested range and the second is this spectrum convolved with a box of width FWHM (defined in the .pat file) and output at the wavelengths/wavenumbers specified in the .pat file.</w:t>
+        <w:t xml:space="preserve"> is an ASCII file containing the computed </w:t>
+      </w:r>
+      <w:r>
+        <w:rPr>
+          <w:rFonts w:ascii="Times New Roman" w:hAnsi="Times New Roman"/>
+        </w:rPr>
+        <w:lastRenderedPageBreak/>
+        <w:t>spectra for each path defined in the .pat file. Two spectra are output per path, one which is the raw spectrum calculated at the k-table wavelengths/wavenumbers spanning the requested range and the second is this spectrum convolved with a box of width FWHM (defined in the .pat file) and output at the wavelengths/wavenumbers specified in the .pat file.</w:t>
       </w:r>
     </w:p>
     <w:p>
@@ -50843,7 +51256,7 @@
 </file>
 
 <file path=customXml/itemProps1.xml><?xml version="1.0" encoding="utf-8"?>
-<ds:datastoreItem xmlns:ds="http://schemas.openxmlformats.org/officeDocument/2006/customXml" ds:itemID="{AAA29315-6B41-884F-BB4D-A1F80E4B7350}">
+<ds:datastoreItem xmlns:ds="http://schemas.openxmlformats.org/officeDocument/2006/customXml" ds:itemID="{4A355A2C-5EA4-6441-9C9A-9F534BC7F044}">
   <ds:schemaRefs>
     <ds:schemaRef ds:uri="http://schemas.openxmlformats.org/officeDocument/2006/bibliography"/>
   </ds:schemaRefs>
@@ -50859,7 +51272,7 @@
 </file>
 
 <file path=customXml/itemProps3.xml><?xml version="1.0" encoding="utf-8"?>
-<ds:datastoreItem xmlns:ds="http://schemas.openxmlformats.org/officeDocument/2006/customXml" ds:itemID="{4A355A2C-5EA4-6441-9C9A-9F534BC7F044}">
+<ds:datastoreItem xmlns:ds="http://schemas.openxmlformats.org/officeDocument/2006/customXml" ds:itemID="{AAA29315-6B41-884F-BB4D-A1F80E4B7350}">
   <ds:schemaRefs>
     <ds:schemaRef ds:uri="http://schemas.openxmlformats.org/officeDocument/2006/bibliography"/>
   </ds:schemaRefs>

</xml_diff>

<commit_message>
Corrected documentation for model=11
</commit_message>
<xml_diff>
--- a/manuals/Nemesis_3.0.docx
+++ b/manuals/Nemesis_3.0.docx
@@ -1738,7 +1738,7 @@
             <w:noProof/>
             <w:webHidden/>
           </w:rPr>
-          <w:t>33</w:t>
+          <w:t>34</w:t>
         </w:r>
         <w:r>
           <w:rPr>
@@ -1813,7 +1813,7 @@
             <w:noProof/>
             <w:webHidden/>
           </w:rPr>
-          <w:t>33</w:t>
+          <w:t>34</w:t>
         </w:r>
         <w:r>
           <w:rPr>
@@ -2486,7 +2486,7 @@
             <w:noProof/>
             <w:webHidden/>
           </w:rPr>
-          <w:t>39</w:t>
+          <w:t>40</w:t>
         </w:r>
         <w:r>
           <w:rPr>
@@ -2561,7 +2561,7 @@
             <w:noProof/>
             <w:webHidden/>
           </w:rPr>
-          <w:t>39</w:t>
+          <w:t>40</w:t>
         </w:r>
         <w:r>
           <w:rPr>
@@ -2711,7 +2711,7 @@
             <w:noProof/>
             <w:webHidden/>
           </w:rPr>
-          <w:t>40</w:t>
+          <w:t>41</w:t>
         </w:r>
         <w:r>
           <w:rPr>
@@ -2786,7 +2786,7 @@
             <w:noProof/>
             <w:webHidden/>
           </w:rPr>
-          <w:t>40</w:t>
+          <w:t>41</w:t>
         </w:r>
         <w:r>
           <w:rPr>
@@ -2861,7 +2861,7 @@
             <w:noProof/>
             <w:webHidden/>
           </w:rPr>
-          <w:t>40</w:t>
+          <w:t>41</w:t>
         </w:r>
         <w:r>
           <w:rPr>
@@ -3011,7 +3011,7 @@
             <w:noProof/>
             <w:webHidden/>
           </w:rPr>
-          <w:t>41</w:t>
+          <w:t>42</w:t>
         </w:r>
         <w:r>
           <w:rPr>
@@ -3086,7 +3086,7 @@
             <w:noProof/>
             <w:webHidden/>
           </w:rPr>
-          <w:t>42</w:t>
+          <w:t>43</w:t>
         </w:r>
         <w:r>
           <w:rPr>
@@ -3161,7 +3161,7 @@
             <w:noProof/>
             <w:webHidden/>
           </w:rPr>
-          <w:t>42</w:t>
+          <w:t>43</w:t>
         </w:r>
         <w:r>
           <w:rPr>
@@ -3236,7 +3236,7 @@
             <w:noProof/>
             <w:webHidden/>
           </w:rPr>
-          <w:t>42</w:t>
+          <w:t>43</w:t>
         </w:r>
         <w:r>
           <w:rPr>
@@ -3311,7 +3311,7 @@
             <w:noProof/>
             <w:webHidden/>
           </w:rPr>
-          <w:t>44</w:t>
+          <w:t>45</w:t>
         </w:r>
         <w:r>
           <w:rPr>
@@ -3386,7 +3386,7 @@
             <w:noProof/>
             <w:webHidden/>
           </w:rPr>
-          <w:t>44</w:t>
+          <w:t>45</w:t>
         </w:r>
         <w:r>
           <w:rPr>
@@ -3461,7 +3461,7 @@
             <w:noProof/>
             <w:webHidden/>
           </w:rPr>
-          <w:t>46</w:t>
+          <w:t>47</w:t>
         </w:r>
         <w:r>
           <w:rPr>
@@ -3537,7 +3537,7 @@
             <w:noProof/>
             <w:webHidden/>
           </w:rPr>
-          <w:t>46</w:t>
+          <w:t>47</w:t>
         </w:r>
         <w:r>
           <w:rPr>
@@ -15994,7 +15994,14 @@
           <w:rFonts w:ascii="Times New Roman" w:hAnsi="Times New Roman"/>
           <w:color w:val="000000"/>
         </w:rPr>
-        <w:t>0) or at all levels</w:t>
+        <w:t>1</w:t>
+      </w:r>
+      <w:r>
+        <w:rPr>
+          <w:rFonts w:ascii="Times New Roman" w:hAnsi="Times New Roman"/>
+          <w:color w:val="000000"/>
+        </w:rPr>
+        <w:t>) or at all levels</w:t>
       </w:r>
       <w:r>
         <w:rPr>
@@ -16024,7 +16031,14 @@
           <w:rFonts w:ascii="Times New Roman" w:hAnsi="Times New Roman"/>
           <w:color w:val="000000"/>
         </w:rPr>
-        <w:t>1)</w:t>
+        <w:t>0</w:t>
+      </w:r>
+      <w:r>
+        <w:rPr>
+          <w:rFonts w:ascii="Times New Roman" w:hAnsi="Times New Roman"/>
+          <w:color w:val="000000"/>
+        </w:rPr>
+        <w:t>)</w:t>
       </w:r>
       <w:r>
         <w:rPr>
@@ -28268,33 +28282,14 @@
         <w:rPr>
           <w:rFonts w:ascii="Times New Roman" w:hAnsi="Times New Roman"/>
         </w:rPr>
-        <w:t xml:space="preserve">Like model </w:t>
-      </w:r>
-      <w:r>
-        <w:rPr>
-          <w:rFonts w:ascii="Times New Roman" w:hAnsi="Times New Roman"/>
-        </w:rPr>
-        <w:t>62, but also condenses a cloud</w:t>
-      </w:r>
-      <w:r>
-        <w:rPr>
-          <w:rFonts w:ascii="Times New Roman" w:hAnsi="Times New Roman"/>
-        </w:rPr>
-        <w:t xml:space="preserve">. </w:t>
-      </w:r>
-      <w:r>
-        <w:rPr>
-          <w:rFonts w:ascii="Times New Roman" w:hAnsi="Times New Roman"/>
-          <w:color w:val="000000"/>
-        </w:rPr>
-        <w:t xml:space="preserve">Model requires the deep gas abundance, middle gas abundance (above a fixed pressure level), desired maximum relative humidity after condensation, and then rate of fall-off of RH above that level. </w:t>
-      </w:r>
-      <w:r>
-        <w:rPr>
-          <w:rFonts w:ascii="Times New Roman" w:hAnsi="Times New Roman"/>
-          <w:color w:val="000000"/>
-        </w:rPr>
-        <w:t xml:space="preserve">Then we have the opacity of the associated cloud and the </w:t>
+        <w:t xml:space="preserve">Like model 62, but also condenses a cloud. </w:t>
+      </w:r>
+      <w:r>
+        <w:rPr>
+          <w:rFonts w:ascii="Times New Roman" w:hAnsi="Times New Roman"/>
+          <w:color w:val="000000"/>
+        </w:rPr>
+        <w:t xml:space="preserve">Model requires the deep gas abundance, middle gas abundance (above a fixed pressure level), desired maximum relative humidity after condensation, and then rate of fall-off of RH above that level. Then we have the opacity of the associated cloud and the </w:t>
       </w:r>
       <w:proofErr w:type="spellStart"/>
       <w:r>
@@ -28324,6 +28319,88 @@
           <w:rFonts w:ascii="Times New Roman" w:hAnsi="Times New Roman"/>
           <w:color w:val="000000"/>
         </w:rPr>
+        <w:t xml:space="preserve"> The next lines of the .</w:t>
+      </w:r>
+      <w:proofErr w:type="spellStart"/>
+      <w:r>
+        <w:rPr>
+          <w:rFonts w:ascii="Times New Roman" w:hAnsi="Times New Roman"/>
+          <w:color w:val="000000"/>
+        </w:rPr>
+        <w:t>apr</w:t>
+      </w:r>
+      <w:proofErr w:type="spellEnd"/>
+      <w:r>
+        <w:rPr>
+          <w:rFonts w:ascii="Times New Roman" w:hAnsi="Times New Roman"/>
+          <w:color w:val="000000"/>
+        </w:rPr>
+        <w:t xml:space="preserve"> file contain: 1) the </w:t>
+      </w:r>
+      <w:r>
+        <w:rPr>
+          <w:rFonts w:ascii="Times New Roman" w:hAnsi="Times New Roman"/>
+          <w:i/>
+          <w:color w:val="000000"/>
+        </w:rPr>
+        <w:t>a priori</w:t>
+      </w:r>
+      <w:r>
+        <w:rPr>
+          <w:rFonts w:ascii="Times New Roman" w:hAnsi="Times New Roman"/>
+          <w:color w:val="000000"/>
+        </w:rPr>
+        <w:t xml:space="preserve"> deep abundance and error; </w:t>
+      </w:r>
+      <w:r>
+        <w:rPr>
+          <w:rFonts w:ascii="Times New Roman" w:hAnsi="Times New Roman"/>
+          <w:color w:val="000000"/>
+        </w:rPr>
+        <w:t>2</w:t>
+      </w:r>
+      <w:r>
+        <w:rPr>
+          <w:rFonts w:ascii="Times New Roman" w:hAnsi="Times New Roman"/>
+          <w:color w:val="000000"/>
+        </w:rPr>
+        <w:t xml:space="preserve">) the </w:t>
+      </w:r>
+      <w:r>
+        <w:rPr>
+          <w:rFonts w:ascii="Times New Roman" w:hAnsi="Times New Roman"/>
+          <w:i/>
+          <w:color w:val="000000"/>
+        </w:rPr>
+        <w:t>a priori</w:t>
+      </w:r>
+      <w:r>
+        <w:rPr>
+          <w:rFonts w:ascii="Times New Roman" w:hAnsi="Times New Roman"/>
+          <w:color w:val="000000"/>
+        </w:rPr>
+        <w:t xml:space="preserve"> middle abundance and error; </w:t>
+      </w:r>
+      <w:r>
+        <w:rPr>
+          <w:rFonts w:ascii="Times New Roman" w:hAnsi="Times New Roman"/>
+          <w:color w:val="000000"/>
+        </w:rPr>
+        <w:t>3</w:t>
+      </w:r>
+      <w:proofErr w:type="gramStart"/>
+      <w:r>
+        <w:rPr>
+          <w:rFonts w:ascii="Times New Roman" w:hAnsi="Times New Roman"/>
+          <w:color w:val="000000"/>
+        </w:rPr>
+        <w:t>)</w:t>
+      </w:r>
+      <w:r>
+        <w:rPr>
+          <w:rFonts w:ascii="Times New Roman" w:hAnsi="Times New Roman"/>
+          <w:color w:val="000000"/>
+        </w:rPr>
         <w:t xml:space="preserve"> </w:t>
       </w:r>
       <w:r>
@@ -28331,23 +28408,15 @@
           <w:rFonts w:ascii="Times New Roman" w:hAnsi="Times New Roman"/>
           <w:color w:val="000000"/>
         </w:rPr>
-        <w:t>The next lines of the .</w:t>
-      </w:r>
-      <w:proofErr w:type="spellStart"/>
-      <w:r>
-        <w:rPr>
-          <w:rFonts w:ascii="Times New Roman" w:hAnsi="Times New Roman"/>
-          <w:color w:val="000000"/>
-        </w:rPr>
-        <w:t>apr</w:t>
-      </w:r>
-      <w:proofErr w:type="spellEnd"/>
-      <w:r>
-        <w:rPr>
-          <w:rFonts w:ascii="Times New Roman" w:hAnsi="Times New Roman"/>
-          <w:color w:val="000000"/>
-        </w:rPr>
-        <w:t xml:space="preserve"> file contain: 1) the </w:t>
+        <w:t xml:space="preserve"> the</w:t>
+      </w:r>
+      <w:proofErr w:type="gramEnd"/>
+      <w:r>
+        <w:rPr>
+          <w:rFonts w:ascii="Times New Roman" w:hAnsi="Times New Roman"/>
+          <w:color w:val="000000"/>
+        </w:rPr>
+        <w:t xml:space="preserve"> </w:t>
       </w:r>
       <w:r>
         <w:rPr>
@@ -28362,87 +28431,6 @@
           <w:rFonts w:ascii="Times New Roman" w:hAnsi="Times New Roman"/>
           <w:color w:val="000000"/>
         </w:rPr>
-        <w:t xml:space="preserve"> deep abundance and error; </w:t>
-      </w:r>
-      <w:r>
-        <w:rPr>
-          <w:rFonts w:ascii="Times New Roman" w:hAnsi="Times New Roman"/>
-          <w:color w:val="000000"/>
-        </w:rPr>
-        <w:t>2</w:t>
-      </w:r>
-      <w:r>
-        <w:rPr>
-          <w:rFonts w:ascii="Times New Roman" w:hAnsi="Times New Roman"/>
-          <w:color w:val="000000"/>
-        </w:rPr>
-        <w:t xml:space="preserve">) the </w:t>
-      </w:r>
-      <w:r>
-        <w:rPr>
-          <w:rFonts w:ascii="Times New Roman" w:hAnsi="Times New Roman"/>
-          <w:i/>
-          <w:color w:val="000000"/>
-        </w:rPr>
-        <w:t>a priori</w:t>
-      </w:r>
-      <w:r>
-        <w:rPr>
-          <w:rFonts w:ascii="Times New Roman" w:hAnsi="Times New Roman"/>
-          <w:color w:val="000000"/>
-        </w:rPr>
-        <w:t xml:space="preserve"> middle abundance and error; </w:t>
-      </w:r>
-      <w:r>
-        <w:rPr>
-          <w:rFonts w:ascii="Times New Roman" w:hAnsi="Times New Roman"/>
-          <w:color w:val="000000"/>
-        </w:rPr>
-        <w:t>3</w:t>
-      </w:r>
-      <w:proofErr w:type="gramStart"/>
-      <w:r>
-        <w:rPr>
-          <w:rFonts w:ascii="Times New Roman" w:hAnsi="Times New Roman"/>
-          <w:color w:val="000000"/>
-        </w:rPr>
-        <w:t>)</w:t>
-      </w:r>
-      <w:r>
-        <w:rPr>
-          <w:rFonts w:ascii="Times New Roman" w:hAnsi="Times New Roman"/>
-          <w:color w:val="000000"/>
-        </w:rPr>
-        <w:t xml:space="preserve"> </w:t>
-      </w:r>
-      <w:r>
-        <w:rPr>
-          <w:rFonts w:ascii="Times New Roman" w:hAnsi="Times New Roman"/>
-          <w:color w:val="000000"/>
-        </w:rPr>
-        <w:t xml:space="preserve"> the</w:t>
-      </w:r>
-      <w:proofErr w:type="gramEnd"/>
-      <w:r>
-        <w:rPr>
-          <w:rFonts w:ascii="Times New Roman" w:hAnsi="Times New Roman"/>
-          <w:color w:val="000000"/>
-        </w:rPr>
-        <w:t xml:space="preserve"> </w:t>
-      </w:r>
-      <w:r>
-        <w:rPr>
-          <w:rFonts w:ascii="Times New Roman" w:hAnsi="Times New Roman"/>
-          <w:i/>
-          <w:color w:val="000000"/>
-        </w:rPr>
-        <w:t>a priori</w:t>
-      </w:r>
-      <w:r>
-        <w:rPr>
-          <w:rFonts w:ascii="Times New Roman" w:hAnsi="Times New Roman"/>
-          <w:color w:val="000000"/>
-        </w:rPr>
         <w:t xml:space="preserve"> relative humidity (RH) and error; 4) the scale height of the RH above the condensation level</w:t>
       </w:r>
       <w:r>
@@ -28457,28 +28445,7 @@
           <w:rFonts w:ascii="Times New Roman" w:hAnsi="Times New Roman"/>
           <w:color w:val="000000"/>
         </w:rPr>
-        <w:t xml:space="preserve">; </w:t>
-      </w:r>
-      <w:r>
-        <w:rPr>
-          <w:rFonts w:ascii="Times New Roman" w:hAnsi="Times New Roman"/>
-          <w:color w:val="000000"/>
-        </w:rPr>
-        <w:t>5</w:t>
-      </w:r>
-      <w:r>
-        <w:rPr>
-          <w:rFonts w:ascii="Times New Roman" w:hAnsi="Times New Roman"/>
-          <w:color w:val="000000"/>
-        </w:rPr>
-        <w:t xml:space="preserve">) </w:t>
-      </w:r>
-      <w:r>
-        <w:rPr>
-          <w:rFonts w:ascii="Times New Roman" w:hAnsi="Times New Roman"/>
-          <w:color w:val="000000"/>
-        </w:rPr>
-        <w:t>the cloud opacity</w:t>
+        <w:t>; 5) the cloud opacity</w:t>
       </w:r>
       <w:r>
         <w:rPr>
@@ -51256,7 +51223,7 @@
 </file>
 
 <file path=customXml/itemProps1.xml><?xml version="1.0" encoding="utf-8"?>
-<ds:datastoreItem xmlns:ds="http://schemas.openxmlformats.org/officeDocument/2006/customXml" ds:itemID="{4A355A2C-5EA4-6441-9C9A-9F534BC7F044}">
+<ds:datastoreItem xmlns:ds="http://schemas.openxmlformats.org/officeDocument/2006/customXml" ds:itemID="{AAA29315-6B41-884F-BB4D-A1F80E4B7350}">
   <ds:schemaRefs>
     <ds:schemaRef ds:uri="http://schemas.openxmlformats.org/officeDocument/2006/bibliography"/>
   </ds:schemaRefs>
@@ -51272,7 +51239,7 @@
 </file>
 
 <file path=customXml/itemProps3.xml><?xml version="1.0" encoding="utf-8"?>
-<ds:datastoreItem xmlns:ds="http://schemas.openxmlformats.org/officeDocument/2006/customXml" ds:itemID="{AAA29315-6B41-884F-BB4D-A1F80E4B7350}">
+<ds:datastoreItem xmlns:ds="http://schemas.openxmlformats.org/officeDocument/2006/customXml" ds:itemID="{4A355A2C-5EA4-6441-9C9A-9F534BC7F044}">
   <ds:schemaRefs>
     <ds:schemaRef ds:uri="http://schemas.openxmlformats.org/officeDocument/2006/bibliography"/>
   </ds:schemaRefs>

</xml_diff>

<commit_message>
Updated for models 65 and 66.
</commit_message>
<xml_diff>
--- a/manuals/Nemesis_3.0.docx
+++ b/manuals/Nemesis_3.0.docx
@@ -28466,7 +28466,21 @@
           <w:rFonts w:ascii="Times New Roman" w:hAnsi="Times New Roman"/>
           <w:color w:val="000000"/>
         </w:rPr>
-        <w:t xml:space="preserve"> and error. Then we have PKNEE and ICONT (i.e., pressure of deep step, and ID of condensing cloud), and finally we have PHAZE and WHAZE which reduced the cloud opacity to zero at levels above PHAZE, with a gaussian cut-off width of WHAZE.</w:t>
+        <w:t xml:space="preserve"> and error. Then we have PKNEE and ICONT (i.e., pressure of deep step, and ID of condensing cloud), and finally we have PHAZE and WHAZE which reduce</w:t>
+      </w:r>
+      <w:r>
+        <w:rPr>
+          <w:rFonts w:ascii="Times New Roman" w:hAnsi="Times New Roman"/>
+          <w:color w:val="000000"/>
+        </w:rPr>
+        <w:t>s</w:t>
+      </w:r>
+      <w:r>
+        <w:rPr>
+          <w:rFonts w:ascii="Times New Roman" w:hAnsi="Times New Roman"/>
+          <w:color w:val="000000"/>
+        </w:rPr>
+        <w:t xml:space="preserve"> the cloud opacity to zero at levels above PHAZE, with a gaussian cut-off width of WHAZE.</w:t>
       </w:r>
       <w:r>
         <w:rPr>
@@ -28659,8 +28673,816 @@
           <w:rFonts w:ascii="Times New Roman" w:hAnsi="Times New Roman"/>
           <w:color w:val="000000"/>
         </w:rPr>
-        <w:t xml:space="preserve">) the cloud scale height and error. Then we have PKNEE and ICONT (i.e., pressure of deep step, and ID of condensing cloud), and finally we have PHAZE and WHAZE which reduced the cloud opacity to zero at levels above PHAZE, with a gaussian cut-off width of WHAZE. </w:t>
-      </w:r>
+        <w:t>) the cloud scale height and error. Then we have PKNEE and ICONT (i.e., pressure of deep step, and ID of condensing cloud), and finally we have PHAZE and WHAZE which reduce</w:t>
+      </w:r>
+      <w:r>
+        <w:rPr>
+          <w:rFonts w:ascii="Times New Roman" w:hAnsi="Times New Roman"/>
+          <w:color w:val="000000"/>
+        </w:rPr>
+        <w:t>s</w:t>
+      </w:r>
+      <w:r>
+        <w:rPr>
+          <w:rFonts w:ascii="Times New Roman" w:hAnsi="Times New Roman"/>
+          <w:color w:val="000000"/>
+        </w:rPr>
+        <w:t xml:space="preserve"> the cloud opacity to zero at levels above PHAZE, with a gaussian cut-off width of WHAZE. </w:t>
+      </w:r>
+    </w:p>
+    <w:p>
+      <w:pPr>
+        <w:pStyle w:val="ListParagraph"/>
+        <w:rPr>
+          <w:rFonts w:ascii="Times New Roman" w:hAnsi="Times New Roman"/>
+        </w:rPr>
+      </w:pPr>
+    </w:p>
+    <w:p>
+      <w:pPr>
+        <w:numPr>
+          <w:ilvl w:val="0"/>
+          <w:numId w:val="18"/>
+        </w:numPr>
+        <w:ind w:left="709" w:hanging="425"/>
+        <w:jc w:val="both"/>
+        <w:rPr>
+          <w:rFonts w:ascii="Times New Roman" w:hAnsi="Times New Roman"/>
+        </w:rPr>
+      </w:pPr>
+      <w:r>
+        <w:rPr>
+          <w:rFonts w:ascii="Times New Roman" w:hAnsi="Times New Roman"/>
+        </w:rPr>
+        <w:t>Like model 6</w:t>
+      </w:r>
+      <w:r>
+        <w:rPr>
+          <w:rFonts w:ascii="Times New Roman" w:hAnsi="Times New Roman"/>
+        </w:rPr>
+        <w:t>4, but model includes a variable offset between the condensation level and the condensed cloud, to match the ‘C-shaped’ cloud profiles familiar from terrestrial studies</w:t>
+      </w:r>
+      <w:r>
+        <w:rPr>
+          <w:rFonts w:ascii="Times New Roman" w:hAnsi="Times New Roman"/>
+        </w:rPr>
+        <w:t>.</w:t>
+      </w:r>
+      <w:r>
+        <w:rPr>
+          <w:rFonts w:ascii="Times New Roman" w:hAnsi="Times New Roman"/>
+          <w:color w:val="000000"/>
+        </w:rPr>
+        <w:t xml:space="preserve"> The next lines of the .</w:t>
+      </w:r>
+      <w:proofErr w:type="spellStart"/>
+      <w:r>
+        <w:rPr>
+          <w:rFonts w:ascii="Times New Roman" w:hAnsi="Times New Roman"/>
+          <w:color w:val="000000"/>
+        </w:rPr>
+        <w:t>apr</w:t>
+      </w:r>
+      <w:proofErr w:type="spellEnd"/>
+      <w:r>
+        <w:rPr>
+          <w:rFonts w:ascii="Times New Roman" w:hAnsi="Times New Roman"/>
+          <w:color w:val="000000"/>
+        </w:rPr>
+        <w:t xml:space="preserve"> file contain: 1) the </w:t>
+      </w:r>
+      <w:r>
+        <w:rPr>
+          <w:rFonts w:ascii="Times New Roman" w:hAnsi="Times New Roman"/>
+          <w:i/>
+          <w:color w:val="000000"/>
+        </w:rPr>
+        <w:t>a priori</w:t>
+      </w:r>
+      <w:r>
+        <w:rPr>
+          <w:rFonts w:ascii="Times New Roman" w:hAnsi="Times New Roman"/>
+          <w:color w:val="000000"/>
+        </w:rPr>
+        <w:t xml:space="preserve"> deep abundance and error; 2) the </w:t>
+      </w:r>
+      <w:r>
+        <w:rPr>
+          <w:rFonts w:ascii="Times New Roman" w:hAnsi="Times New Roman"/>
+          <w:i/>
+          <w:color w:val="000000"/>
+        </w:rPr>
+        <w:t>a priori</w:t>
+      </w:r>
+      <w:r>
+        <w:rPr>
+          <w:rFonts w:ascii="Times New Roman" w:hAnsi="Times New Roman"/>
+          <w:color w:val="000000"/>
+        </w:rPr>
+        <w:t xml:space="preserve"> middle abundance and error; 3) </w:t>
+      </w:r>
+      <w:r>
+        <w:rPr>
+          <w:rFonts w:ascii="Times New Roman" w:hAnsi="Times New Roman"/>
+          <w:color w:val="000000"/>
+        </w:rPr>
+        <w:t>the fractional scale height above PKNEE and error;</w:t>
+      </w:r>
+      <w:r>
+        <w:rPr>
+          <w:rFonts w:ascii="Times New Roman" w:hAnsi="Times New Roman"/>
+          <w:color w:val="000000"/>
+        </w:rPr>
+        <w:t xml:space="preserve"> </w:t>
+      </w:r>
+      <w:r>
+        <w:rPr>
+          <w:rFonts w:ascii="Times New Roman" w:hAnsi="Times New Roman"/>
+          <w:color w:val="000000"/>
+        </w:rPr>
+        <w:t>4</w:t>
+      </w:r>
+      <w:r>
+        <w:rPr>
+          <w:rFonts w:ascii="Times New Roman" w:hAnsi="Times New Roman"/>
+          <w:color w:val="000000"/>
+        </w:rPr>
+        <w:t xml:space="preserve">) the </w:t>
+      </w:r>
+      <w:r>
+        <w:rPr>
+          <w:rFonts w:ascii="Times New Roman" w:hAnsi="Times New Roman"/>
+          <w:i/>
+          <w:color w:val="000000"/>
+        </w:rPr>
+        <w:t>a priori</w:t>
+      </w:r>
+      <w:r>
+        <w:rPr>
+          <w:rFonts w:ascii="Times New Roman" w:hAnsi="Times New Roman"/>
+          <w:color w:val="000000"/>
+        </w:rPr>
+        <w:t xml:space="preserve"> relative humidity (RH) and error; </w:t>
+      </w:r>
+      <w:r>
+        <w:rPr>
+          <w:rFonts w:ascii="Times New Roman" w:hAnsi="Times New Roman"/>
+          <w:color w:val="000000"/>
+        </w:rPr>
+        <w:t>5</w:t>
+      </w:r>
+      <w:r>
+        <w:rPr>
+          <w:rFonts w:ascii="Times New Roman" w:hAnsi="Times New Roman"/>
+          <w:color w:val="000000"/>
+        </w:rPr>
+        <w:t xml:space="preserve">) the scale height of the RH above the condensation level and error; </w:t>
+      </w:r>
+      <w:r>
+        <w:rPr>
+          <w:rFonts w:ascii="Times New Roman" w:hAnsi="Times New Roman"/>
+          <w:color w:val="000000"/>
+        </w:rPr>
+        <w:t>6</w:t>
+      </w:r>
+      <w:r>
+        <w:rPr>
+          <w:rFonts w:ascii="Times New Roman" w:hAnsi="Times New Roman"/>
+          <w:color w:val="000000"/>
+        </w:rPr>
+        <w:t xml:space="preserve">) the cloud opacity and error; </w:t>
+      </w:r>
+      <w:r>
+        <w:rPr>
+          <w:rFonts w:ascii="Times New Roman" w:hAnsi="Times New Roman"/>
+          <w:color w:val="000000"/>
+        </w:rPr>
+        <w:t>7</w:t>
+      </w:r>
+      <w:r>
+        <w:rPr>
+          <w:rFonts w:ascii="Times New Roman" w:hAnsi="Times New Roman"/>
+          <w:color w:val="000000"/>
+        </w:rPr>
+        <w:t>) the cloud scale height and error</w:t>
+      </w:r>
+      <w:r>
+        <w:rPr>
+          <w:rFonts w:ascii="Times New Roman" w:hAnsi="Times New Roman"/>
+          <w:color w:val="000000"/>
+        </w:rPr>
+        <w:t>; 8) the offset of the cloud base from the condensation level.</w:t>
+      </w:r>
+      <w:r>
+        <w:rPr>
+          <w:rFonts w:ascii="Times New Roman" w:hAnsi="Times New Roman"/>
+          <w:color w:val="000000"/>
+        </w:rPr>
+        <w:t xml:space="preserve"> Then we have PKNEE and ICONT (i.e., pressure of deep step, and ID of condensing cloud), and finally we have PHAZE and WHAZE which reduce</w:t>
+      </w:r>
+      <w:r>
+        <w:rPr>
+          <w:rFonts w:ascii="Times New Roman" w:hAnsi="Times New Roman"/>
+          <w:color w:val="000000"/>
+        </w:rPr>
+        <w:t>s</w:t>
+      </w:r>
+      <w:r>
+        <w:rPr>
+          <w:rFonts w:ascii="Times New Roman" w:hAnsi="Times New Roman"/>
+          <w:color w:val="000000"/>
+        </w:rPr>
+        <w:t xml:space="preserve"> the cloud opacity to zero at levels above PHAZE, with a gaussian cut-off width of WHAZE. </w:t>
+      </w:r>
+    </w:p>
+    <w:p>
+      <w:pPr>
+        <w:jc w:val="both"/>
+        <w:rPr>
+          <w:rFonts w:ascii="Times New Roman" w:hAnsi="Times New Roman"/>
+        </w:rPr>
+      </w:pPr>
+    </w:p>
+    <w:p>
+      <w:pPr>
+        <w:numPr>
+          <w:ilvl w:val="0"/>
+          <w:numId w:val="18"/>
+        </w:numPr>
+        <w:ind w:left="709" w:hanging="425"/>
+        <w:jc w:val="both"/>
+        <w:rPr>
+          <w:rFonts w:ascii="Times New Roman" w:hAnsi="Times New Roman"/>
+        </w:rPr>
+      </w:pPr>
+      <w:r>
+        <w:rPr>
+          <w:rFonts w:ascii="Times New Roman" w:hAnsi="Times New Roman"/>
+        </w:rPr>
+        <w:t>Like model 6</w:t>
+      </w:r>
+      <w:r>
+        <w:rPr>
+          <w:rFonts w:ascii="Times New Roman" w:hAnsi="Times New Roman"/>
+        </w:rPr>
+        <w:t>4</w:t>
+      </w:r>
+      <w:r>
+        <w:rPr>
+          <w:rFonts w:ascii="Times New Roman" w:hAnsi="Times New Roman"/>
+        </w:rPr>
+        <w:t xml:space="preserve">, </w:t>
+      </w:r>
+      <w:r>
+        <w:rPr>
+          <w:rFonts w:ascii="Times New Roman" w:hAnsi="Times New Roman"/>
+        </w:rPr>
+        <w:t xml:space="preserve">but </w:t>
+      </w:r>
+      <w:r>
+        <w:rPr>
+          <w:rFonts w:ascii="Times New Roman" w:hAnsi="Times New Roman"/>
+        </w:rPr>
+        <w:t xml:space="preserve">this model gas two associated cloud profiles, one at a variable PCLOUD, where the gas </w:t>
+      </w:r>
+      <w:proofErr w:type="spellStart"/>
+      <w:r>
+        <w:rPr>
+          <w:rFonts w:ascii="Times New Roman" w:hAnsi="Times New Roman"/>
+        </w:rPr>
+        <w:t>vmr</w:t>
+      </w:r>
+      <w:proofErr w:type="spellEnd"/>
+      <w:r>
+        <w:rPr>
+          <w:rFonts w:ascii="Times New Roman" w:hAnsi="Times New Roman"/>
+        </w:rPr>
+        <w:t xml:space="preserve"> first drops, and then at the condensation level</w:t>
+      </w:r>
+      <w:r>
+        <w:rPr>
+          <w:rFonts w:ascii="Times New Roman" w:hAnsi="Times New Roman"/>
+        </w:rPr>
+        <w:t>.</w:t>
+      </w:r>
+      <w:r>
+        <w:rPr>
+          <w:rFonts w:ascii="Times New Roman" w:hAnsi="Times New Roman"/>
+          <w:color w:val="000000"/>
+        </w:rPr>
+        <w:t xml:space="preserve"> The next lines of the .</w:t>
+      </w:r>
+      <w:proofErr w:type="spellStart"/>
+      <w:r>
+        <w:rPr>
+          <w:rFonts w:ascii="Times New Roman" w:hAnsi="Times New Roman"/>
+          <w:color w:val="000000"/>
+        </w:rPr>
+        <w:t>apr</w:t>
+      </w:r>
+      <w:proofErr w:type="spellEnd"/>
+      <w:r>
+        <w:rPr>
+          <w:rFonts w:ascii="Times New Roman" w:hAnsi="Times New Roman"/>
+          <w:color w:val="000000"/>
+        </w:rPr>
+        <w:t xml:space="preserve"> file contain: 1) the </w:t>
+      </w:r>
+      <w:r>
+        <w:rPr>
+          <w:rFonts w:ascii="Times New Roman" w:hAnsi="Times New Roman"/>
+          <w:i/>
+          <w:color w:val="000000"/>
+        </w:rPr>
+        <w:t>a priori</w:t>
+      </w:r>
+      <w:r>
+        <w:rPr>
+          <w:rFonts w:ascii="Times New Roman" w:hAnsi="Times New Roman"/>
+          <w:color w:val="000000"/>
+        </w:rPr>
+        <w:t xml:space="preserve"> </w:t>
+      </w:r>
+      <w:r>
+        <w:rPr>
+          <w:rFonts w:ascii="Times New Roman" w:hAnsi="Times New Roman"/>
+          <w:color w:val="000000"/>
+        </w:rPr>
+        <w:t xml:space="preserve">gas </w:t>
+      </w:r>
+      <w:r>
+        <w:rPr>
+          <w:rFonts w:ascii="Times New Roman" w:hAnsi="Times New Roman"/>
+          <w:color w:val="000000"/>
+        </w:rPr>
+        <w:t xml:space="preserve">deep abundance and error; 2) the </w:t>
+      </w:r>
+      <w:r>
+        <w:rPr>
+          <w:rFonts w:ascii="Times New Roman" w:hAnsi="Times New Roman"/>
+          <w:i/>
+          <w:color w:val="000000"/>
+        </w:rPr>
+        <w:t>a priori</w:t>
+      </w:r>
+      <w:r>
+        <w:rPr>
+          <w:rFonts w:ascii="Times New Roman" w:hAnsi="Times New Roman"/>
+          <w:color w:val="000000"/>
+        </w:rPr>
+        <w:t xml:space="preserve"> middle </w:t>
+      </w:r>
+      <w:r>
+        <w:rPr>
+          <w:rFonts w:ascii="Times New Roman" w:hAnsi="Times New Roman"/>
+          <w:color w:val="000000"/>
+        </w:rPr>
+        <w:t xml:space="preserve">gas </w:t>
+      </w:r>
+      <w:r>
+        <w:rPr>
+          <w:rFonts w:ascii="Times New Roman" w:hAnsi="Times New Roman"/>
+          <w:color w:val="000000"/>
+        </w:rPr>
+        <w:t>abundance and error</w:t>
+      </w:r>
+      <w:r>
+        <w:rPr>
+          <w:rFonts w:ascii="Times New Roman" w:hAnsi="Times New Roman"/>
+          <w:color w:val="000000"/>
+        </w:rPr>
+        <w:t xml:space="preserve"> at pressures less than PCLOUD</w:t>
+      </w:r>
+      <w:r>
+        <w:rPr>
+          <w:rFonts w:ascii="Times New Roman" w:hAnsi="Times New Roman"/>
+          <w:color w:val="000000"/>
+        </w:rPr>
+        <w:t xml:space="preserve">; 3) </w:t>
+      </w:r>
+      <w:r>
+        <w:rPr>
+          <w:rFonts w:ascii="Times New Roman" w:hAnsi="Times New Roman"/>
+          <w:color w:val="000000"/>
+        </w:rPr>
+        <w:t>the fractional scale height of above P</w:t>
+      </w:r>
+      <w:r>
+        <w:rPr>
+          <w:rFonts w:ascii="Times New Roman" w:hAnsi="Times New Roman"/>
+          <w:color w:val="000000"/>
+        </w:rPr>
+        <w:t>CLOUD</w:t>
+      </w:r>
+      <w:r>
+        <w:rPr>
+          <w:rFonts w:ascii="Times New Roman" w:hAnsi="Times New Roman"/>
+          <w:color w:val="000000"/>
+        </w:rPr>
+        <w:t xml:space="preserve"> and error;</w:t>
+      </w:r>
+      <w:r>
+        <w:rPr>
+          <w:rFonts w:ascii="Times New Roman" w:hAnsi="Times New Roman"/>
+          <w:color w:val="000000"/>
+        </w:rPr>
+        <w:t xml:space="preserve"> </w:t>
+      </w:r>
+      <w:r>
+        <w:rPr>
+          <w:rFonts w:ascii="Times New Roman" w:hAnsi="Times New Roman"/>
+          <w:color w:val="000000"/>
+        </w:rPr>
+        <w:t>4</w:t>
+      </w:r>
+      <w:r>
+        <w:rPr>
+          <w:rFonts w:ascii="Times New Roman" w:hAnsi="Times New Roman"/>
+          <w:color w:val="000000"/>
+        </w:rPr>
+        <w:t xml:space="preserve">) the </w:t>
+      </w:r>
+      <w:r>
+        <w:rPr>
+          <w:rFonts w:ascii="Times New Roman" w:hAnsi="Times New Roman"/>
+          <w:i/>
+          <w:color w:val="000000"/>
+        </w:rPr>
+        <w:t>a priori</w:t>
+      </w:r>
+      <w:r>
+        <w:rPr>
+          <w:rFonts w:ascii="Times New Roman" w:hAnsi="Times New Roman"/>
+          <w:color w:val="000000"/>
+        </w:rPr>
+        <w:t xml:space="preserve"> relative humidity (RH) and error; </w:t>
+      </w:r>
+      <w:r>
+        <w:rPr>
+          <w:rFonts w:ascii="Times New Roman" w:hAnsi="Times New Roman"/>
+          <w:color w:val="000000"/>
+        </w:rPr>
+        <w:t>5</w:t>
+      </w:r>
+      <w:r>
+        <w:rPr>
+          <w:rFonts w:ascii="Times New Roman" w:hAnsi="Times New Roman"/>
+          <w:color w:val="000000"/>
+        </w:rPr>
+        <w:t xml:space="preserve">) the scale height of the RH above the </w:t>
+      </w:r>
+      <w:r>
+        <w:rPr>
+          <w:rFonts w:ascii="Times New Roman" w:hAnsi="Times New Roman"/>
+          <w:color w:val="000000"/>
+        </w:rPr>
+        <w:lastRenderedPageBreak/>
+        <w:t xml:space="preserve">condensation level and error; </w:t>
+      </w:r>
+      <w:r>
+        <w:rPr>
+          <w:rFonts w:ascii="Times New Roman" w:hAnsi="Times New Roman"/>
+          <w:color w:val="000000"/>
+        </w:rPr>
+        <w:t>6</w:t>
+      </w:r>
+      <w:r>
+        <w:rPr>
+          <w:rFonts w:ascii="Times New Roman" w:hAnsi="Times New Roman"/>
+          <w:color w:val="000000"/>
+        </w:rPr>
+        <w:t xml:space="preserve">) the </w:t>
+      </w:r>
+      <w:r>
+        <w:rPr>
+          <w:rFonts w:ascii="Times New Roman" w:hAnsi="Times New Roman"/>
+          <w:color w:val="000000"/>
+        </w:rPr>
+        <w:t>1</w:t>
+      </w:r>
+      <w:r>
+        <w:rPr>
+          <w:rFonts w:ascii="Times New Roman" w:hAnsi="Times New Roman"/>
+          <w:color w:val="000000"/>
+          <w:vertAlign w:val="superscript"/>
+        </w:rPr>
+        <w:t>st</w:t>
+      </w:r>
+      <w:r>
+        <w:rPr>
+          <w:rFonts w:ascii="Times New Roman" w:hAnsi="Times New Roman"/>
+          <w:color w:val="000000"/>
+        </w:rPr>
+        <w:t xml:space="preserve"> </w:t>
+      </w:r>
+      <w:r>
+        <w:rPr>
+          <w:rFonts w:ascii="Times New Roman" w:hAnsi="Times New Roman"/>
+          <w:color w:val="000000"/>
+        </w:rPr>
+        <w:t xml:space="preserve">cloud opacity and error; </w:t>
+      </w:r>
+      <w:r>
+        <w:rPr>
+          <w:rFonts w:ascii="Times New Roman" w:hAnsi="Times New Roman"/>
+          <w:color w:val="000000"/>
+        </w:rPr>
+        <w:t>7</w:t>
+      </w:r>
+      <w:r>
+        <w:rPr>
+          <w:rFonts w:ascii="Times New Roman" w:hAnsi="Times New Roman"/>
+          <w:color w:val="000000"/>
+        </w:rPr>
+        <w:t xml:space="preserve">) the </w:t>
+      </w:r>
+      <w:r>
+        <w:rPr>
+          <w:rFonts w:ascii="Times New Roman" w:hAnsi="Times New Roman"/>
+          <w:color w:val="000000"/>
+        </w:rPr>
+        <w:t>1</w:t>
+      </w:r>
+      <w:r>
+        <w:rPr>
+          <w:rFonts w:ascii="Times New Roman" w:hAnsi="Times New Roman"/>
+          <w:color w:val="000000"/>
+          <w:vertAlign w:val="superscript"/>
+        </w:rPr>
+        <w:t>st</w:t>
+      </w:r>
+      <w:r>
+        <w:rPr>
+          <w:rFonts w:ascii="Times New Roman" w:hAnsi="Times New Roman"/>
+          <w:color w:val="000000"/>
+        </w:rPr>
+        <w:t xml:space="preserve"> </w:t>
+      </w:r>
+      <w:r>
+        <w:rPr>
+          <w:rFonts w:ascii="Times New Roman" w:hAnsi="Times New Roman"/>
+          <w:color w:val="000000"/>
+        </w:rPr>
+        <w:t>cloud scale height and error</w:t>
+      </w:r>
+      <w:r>
+        <w:rPr>
+          <w:rFonts w:ascii="Times New Roman" w:hAnsi="Times New Roman"/>
+          <w:color w:val="000000"/>
+        </w:rPr>
+        <w:t>; 8) the 1</w:t>
+      </w:r>
+      <w:r>
+        <w:rPr>
+          <w:rFonts w:ascii="Times New Roman" w:hAnsi="Times New Roman"/>
+          <w:color w:val="000000"/>
+          <w:vertAlign w:val="superscript"/>
+        </w:rPr>
+        <w:t>st</w:t>
+      </w:r>
+      <w:r>
+        <w:rPr>
+          <w:rFonts w:ascii="Times New Roman" w:hAnsi="Times New Roman"/>
+          <w:color w:val="000000"/>
+        </w:rPr>
+        <w:t xml:space="preserve"> cloud base pressure (PCLOUD) and error; 9) </w:t>
+      </w:r>
+      <w:r>
+        <w:rPr>
+          <w:rFonts w:ascii="Times New Roman" w:hAnsi="Times New Roman"/>
+          <w:color w:val="000000"/>
+        </w:rPr>
+        <w:t>the</w:t>
+      </w:r>
+      <w:r>
+        <w:rPr>
+          <w:rFonts w:ascii="Times New Roman" w:hAnsi="Times New Roman"/>
+          <w:color w:val="000000"/>
+        </w:rPr>
+        <w:t xml:space="preserve"> 2nd</w:t>
+      </w:r>
+      <w:r>
+        <w:rPr>
+          <w:rFonts w:ascii="Times New Roman" w:hAnsi="Times New Roman"/>
+          <w:color w:val="000000"/>
+        </w:rPr>
+        <w:t xml:space="preserve"> </w:t>
+      </w:r>
+      <w:r>
+        <w:rPr>
+          <w:rFonts w:ascii="Times New Roman" w:hAnsi="Times New Roman"/>
+          <w:color w:val="000000"/>
+        </w:rPr>
+        <w:t xml:space="preserve">cloud opacity and error; </w:t>
+      </w:r>
+      <w:r>
+        <w:rPr>
+          <w:rFonts w:ascii="Times New Roman" w:hAnsi="Times New Roman"/>
+          <w:color w:val="000000"/>
+        </w:rPr>
+        <w:t>10</w:t>
+      </w:r>
+      <w:r>
+        <w:rPr>
+          <w:rFonts w:ascii="Times New Roman" w:hAnsi="Times New Roman"/>
+          <w:color w:val="000000"/>
+        </w:rPr>
+        <w:t xml:space="preserve">) the </w:t>
+      </w:r>
+      <w:r>
+        <w:rPr>
+          <w:rFonts w:ascii="Times New Roman" w:hAnsi="Times New Roman"/>
+          <w:color w:val="000000"/>
+        </w:rPr>
+        <w:t>2</w:t>
+      </w:r>
+      <w:r>
+        <w:rPr>
+          <w:rFonts w:ascii="Times New Roman" w:hAnsi="Times New Roman"/>
+          <w:color w:val="000000"/>
+          <w:vertAlign w:val="superscript"/>
+        </w:rPr>
+        <w:t>nd</w:t>
+      </w:r>
+      <w:r>
+        <w:rPr>
+          <w:rFonts w:ascii="Times New Roman" w:hAnsi="Times New Roman"/>
+          <w:color w:val="000000"/>
+        </w:rPr>
+        <w:t xml:space="preserve"> </w:t>
+      </w:r>
+      <w:r>
+        <w:rPr>
+          <w:rFonts w:ascii="Times New Roman" w:hAnsi="Times New Roman"/>
+          <w:color w:val="000000"/>
+        </w:rPr>
+        <w:t>cloud scale height and error</w:t>
+      </w:r>
+      <w:r>
+        <w:rPr>
+          <w:rFonts w:ascii="Times New Roman" w:hAnsi="Times New Roman"/>
+          <w:color w:val="000000"/>
+        </w:rPr>
+        <w:t>;</w:t>
+      </w:r>
+      <w:r>
+        <w:rPr>
+          <w:rFonts w:ascii="Times New Roman" w:hAnsi="Times New Roman"/>
+          <w:color w:val="000000"/>
+        </w:rPr>
+        <w:t xml:space="preserve"> Then we have PHAZE</w:t>
+      </w:r>
+      <w:r>
+        <w:rPr>
+          <w:rFonts w:ascii="Times New Roman" w:hAnsi="Times New Roman"/>
+          <w:color w:val="000000"/>
+        </w:rPr>
+        <w:t>1</w:t>
+      </w:r>
+      <w:r>
+        <w:rPr>
+          <w:rFonts w:ascii="Times New Roman" w:hAnsi="Times New Roman"/>
+          <w:color w:val="000000"/>
+        </w:rPr>
+        <w:t xml:space="preserve"> and WHAZE</w:t>
+      </w:r>
+      <w:r>
+        <w:rPr>
+          <w:rFonts w:ascii="Times New Roman" w:hAnsi="Times New Roman"/>
+          <w:color w:val="000000"/>
+        </w:rPr>
+        <w:t>1</w:t>
+      </w:r>
+      <w:r>
+        <w:rPr>
+          <w:rFonts w:ascii="Times New Roman" w:hAnsi="Times New Roman"/>
+          <w:color w:val="000000"/>
+        </w:rPr>
+        <w:t xml:space="preserve"> which reduce</w:t>
+      </w:r>
+      <w:r>
+        <w:rPr>
+          <w:rFonts w:ascii="Times New Roman" w:hAnsi="Times New Roman"/>
+          <w:color w:val="000000"/>
+        </w:rPr>
+        <w:t>s</w:t>
+      </w:r>
+      <w:r>
+        <w:rPr>
+          <w:rFonts w:ascii="Times New Roman" w:hAnsi="Times New Roman"/>
+          <w:color w:val="000000"/>
+        </w:rPr>
+        <w:t xml:space="preserve"> the </w:t>
+      </w:r>
+      <w:r>
+        <w:rPr>
+          <w:rFonts w:ascii="Times New Roman" w:hAnsi="Times New Roman"/>
+          <w:color w:val="000000"/>
+        </w:rPr>
+        <w:t>1</w:t>
+      </w:r>
+      <w:r>
+        <w:rPr>
+          <w:rFonts w:ascii="Times New Roman" w:hAnsi="Times New Roman"/>
+          <w:color w:val="000000"/>
+          <w:vertAlign w:val="superscript"/>
+        </w:rPr>
+        <w:t>st</w:t>
+      </w:r>
+      <w:r>
+        <w:rPr>
+          <w:rFonts w:ascii="Times New Roman" w:hAnsi="Times New Roman"/>
+          <w:color w:val="000000"/>
+        </w:rPr>
+        <w:t xml:space="preserve"> </w:t>
+      </w:r>
+      <w:r>
+        <w:rPr>
+          <w:rFonts w:ascii="Times New Roman" w:hAnsi="Times New Roman"/>
+          <w:color w:val="000000"/>
+        </w:rPr>
+        <w:t>cloud opacity to zero at levels above PHAZE</w:t>
+      </w:r>
+      <w:r>
+        <w:rPr>
+          <w:rFonts w:ascii="Times New Roman" w:hAnsi="Times New Roman"/>
+          <w:color w:val="000000"/>
+        </w:rPr>
+        <w:t>1</w:t>
+      </w:r>
+      <w:r>
+        <w:rPr>
+          <w:rFonts w:ascii="Times New Roman" w:hAnsi="Times New Roman"/>
+          <w:color w:val="000000"/>
+        </w:rPr>
+        <w:t>, with a gaussian cut-off width of WHAZE</w:t>
+      </w:r>
+      <w:r>
+        <w:rPr>
+          <w:rFonts w:ascii="Times New Roman" w:hAnsi="Times New Roman"/>
+          <w:color w:val="000000"/>
+        </w:rPr>
+        <w:t>1</w:t>
+      </w:r>
+      <w:r>
+        <w:rPr>
+          <w:rFonts w:ascii="Times New Roman" w:hAnsi="Times New Roman"/>
+          <w:color w:val="000000"/>
+        </w:rPr>
+        <w:t>.</w:t>
+      </w:r>
+      <w:r>
+        <w:rPr>
+          <w:rFonts w:ascii="Times New Roman" w:hAnsi="Times New Roman"/>
+          <w:color w:val="000000"/>
+        </w:rPr>
+        <w:t xml:space="preserve"> The we </w:t>
+      </w:r>
+      <w:proofErr w:type="gramStart"/>
+      <w:r>
+        <w:rPr>
+          <w:rFonts w:ascii="Times New Roman" w:hAnsi="Times New Roman"/>
+          <w:color w:val="000000"/>
+        </w:rPr>
+        <w:t xml:space="preserve">have </w:t>
+      </w:r>
+      <w:r>
+        <w:rPr>
+          <w:rFonts w:ascii="Times New Roman" w:hAnsi="Times New Roman"/>
+          <w:color w:val="000000"/>
+        </w:rPr>
+        <w:t xml:space="preserve"> PHAZE</w:t>
+      </w:r>
+      <w:proofErr w:type="gramEnd"/>
+      <w:r>
+        <w:rPr>
+          <w:rFonts w:ascii="Times New Roman" w:hAnsi="Times New Roman"/>
+          <w:color w:val="000000"/>
+        </w:rPr>
+        <w:t>2</w:t>
+      </w:r>
+      <w:r>
+        <w:rPr>
+          <w:rFonts w:ascii="Times New Roman" w:hAnsi="Times New Roman"/>
+          <w:color w:val="000000"/>
+        </w:rPr>
+        <w:t xml:space="preserve"> and WHAZE</w:t>
+      </w:r>
+      <w:r>
+        <w:rPr>
+          <w:rFonts w:ascii="Times New Roman" w:hAnsi="Times New Roman"/>
+          <w:color w:val="000000"/>
+        </w:rPr>
+        <w:t>2 for the second cloud.</w:t>
+      </w:r>
+    </w:p>
+    <w:p>
+      <w:pPr>
+        <w:jc w:val="both"/>
+        <w:rPr>
+          <w:rFonts w:ascii="Times New Roman" w:hAnsi="Times New Roman"/>
+        </w:rPr>
+      </w:pPr>
     </w:p>
     <w:p>
       <w:pPr>
@@ -29035,7 +29857,6 @@
         <w:rPr>
           <w:rFonts w:ascii="Times New Roman" w:hAnsi="Times New Roman"/>
         </w:rPr>
-        <w:lastRenderedPageBreak/>
         <w:t>ENAME</w:t>
       </w:r>
     </w:p>
@@ -29479,6 +30300,7 @@
         <w:rPr>
           <w:rFonts w:ascii="Times New Roman" w:hAnsi="Times New Roman"/>
         </w:rPr>
+        <w:lastRenderedPageBreak/>
         <w:t>ILBL = 0 indicates that a correlated-K calculation is required. ILBL=1</w:t>
       </w:r>
       <w:r>
@@ -30040,6 +30862,7 @@
         <w:rPr>
           <w:rFonts w:ascii="Times New Roman" w:hAnsi="Times New Roman"/>
         </w:rPr>
+        <w:lastRenderedPageBreak/>
         <w:t>If LIN is set to 3, then the previous retrievals are read in, and if any variable is the same as one of the variables to be retrieved (as listed in the .</w:t>
       </w:r>
       <w:proofErr w:type="spellStart"/>
@@ -30391,7 +31214,6 @@
         <w:rPr>
           <w:rFonts w:ascii="Times New Roman" w:hAnsi="Times New Roman"/>
         </w:rPr>
-        <w:lastRenderedPageBreak/>
         <w:t>NAV(</w:t>
       </w:r>
       <w:proofErr w:type="gramEnd"/>
@@ -31296,6 +32118,7 @@
         <w:rPr>
           <w:rFonts w:ascii="Times New Roman" w:hAnsi="Times New Roman"/>
         </w:rPr>
+        <w:lastRenderedPageBreak/>
         <w:t>… weights, angles and spectra repeated for NGEOM spectra in total.</w:t>
       </w:r>
     </w:p>
@@ -31561,14 +32384,7 @@
         <w:rPr>
           <w:rFonts w:ascii="Times New Roman" w:hAnsi="Times New Roman"/>
         </w:rPr>
-        <w:t xml:space="preserve">. NAV specifies how many individual spectra need to be calculated and averaged to simulate </w:t>
-      </w:r>
-      <w:r>
-        <w:rPr>
-          <w:rFonts w:ascii="Times New Roman" w:hAnsi="Times New Roman"/>
-        </w:rPr>
-        <w:lastRenderedPageBreak/>
-        <w:t xml:space="preserve">the measured field-of-view-averaged spectrum. The next NAV lines contain the integration point latitudes (FLAT), longitudes (FLON), viewing angles (SOL_ANG, EMISS_ANG, AZI_ANG) and weights (WGEOM). The angle definitions are outlined in Figure 1. Following this, there then follows the actual measured wavelengths/wavenumbers, spectrum and errors (all of length NCONV) which are read in and put in total measurement vector </w:t>
+        <w:t xml:space="preserve">. NAV specifies how many individual spectra need to be calculated and averaged to simulate the measured field-of-view-averaged spectrum. The next NAV lines contain the integration point latitudes (FLAT), longitudes (FLON), viewing angles (SOL_ANG, EMISS_ANG, AZI_ANG) and weights (WGEOM). The angle definitions are outlined in Figure 1. Following this, there then follows the actual measured wavelengths/wavenumbers, spectrum and errors (all of length NCONV) which are read in and put in total measurement vector </w:t>
       </w:r>
       <w:r>
         <w:rPr>
@@ -32001,6 +32817,7 @@
           <w:rFonts w:ascii="Times New Roman" w:hAnsi="Times New Roman"/>
           <w:noProof/>
         </w:rPr>
+        <w:lastRenderedPageBreak/>
         <w:drawing>
           <wp:inline distT="0" distB="0" distL="0" distR="0" wp14:anchorId="363BC331" wp14:editId="3DD5782D">
             <wp:extent cx="3319397" cy="2652718"/>
@@ -33733,6 +34550,7 @@
         <w:rPr>
           <w:rFonts w:ascii="Times New Roman" w:hAnsi="Times New Roman"/>
         </w:rPr>
+        <w:lastRenderedPageBreak/>
         <w:t>This file (&lt;</w:t>
       </w:r>
       <w:proofErr w:type="spellStart"/>
@@ -34583,7 +35401,6 @@
         <w:rPr>
           <w:rFonts w:ascii="Times New Roman" w:hAnsi="Times New Roman"/>
         </w:rPr>
-        <w:lastRenderedPageBreak/>
         <w:t>IH2O</w:t>
       </w:r>
       <w:r>
@@ -35051,6 +35868,7 @@
               <w:rPr>
                 <w:rFonts w:ascii="Times New Roman" w:hAnsi="Times New Roman"/>
               </w:rPr>
+              <w:lastRenderedPageBreak/>
               <w:t>1</w:t>
             </w:r>
           </w:p>
@@ -35935,7 +36753,6 @@
         <w:rPr>
           <w:rFonts w:ascii="Times New Roman" w:hAnsi="Times New Roman"/>
         </w:rPr>
-        <w:lastRenderedPageBreak/>
         <w:t xml:space="preserve">The first line of the file gives the number of gases, NVP, whose abundances are to be limited by condensation. There then flow NVP lines, each listing: </w:t>
       </w:r>
     </w:p>
@@ -36479,6 +37296,7 @@
           <w:szCs w:val="24"/>
           <w:lang w:val="en-US"/>
         </w:rPr>
+        <w:lastRenderedPageBreak/>
         <w:t>N.B. T</w:t>
       </w:r>
       <w:r>
@@ -37286,7 +38104,6 @@
           <w:szCs w:val="24"/>
           <w:lang w:val="en-US"/>
         </w:rPr>
-        <w:lastRenderedPageBreak/>
         <w:t>#Leave a blank line below the last comment</w:t>
       </w:r>
     </w:p>
@@ -37845,6 +38662,7 @@
         <w:rPr>
           <w:rFonts w:ascii="Courier New" w:hAnsi="Courier New" w:cs="Courier New"/>
         </w:rPr>
+        <w:lastRenderedPageBreak/>
         <w:t>calc_nlte_t.f</w:t>
       </w:r>
       <w:proofErr w:type="spellEnd"/>
@@ -38863,7 +39681,6 @@
               <w:rPr>
                 <w:rFonts w:ascii="Times New Roman" w:hAnsi="Times New Roman"/>
               </w:rPr>
-              <w:lastRenderedPageBreak/>
               <w:t>2</w:t>
             </w:r>
           </w:p>
@@ -38981,6 +39798,7 @@
               <w:rPr>
                 <w:rFonts w:ascii="Times New Roman" w:hAnsi="Times New Roman"/>
               </w:rPr>
+              <w:lastRenderedPageBreak/>
               <w:t>f = p*1.0e6 / (1.0 + p*1.0e6)</w:t>
             </w:r>
           </w:p>
@@ -39428,14 +40246,7 @@
         <w:rPr>
           <w:rFonts w:ascii="Times New Roman" w:hAnsi="Times New Roman"/>
         </w:rPr>
-        <w:t xml:space="preserve"> to contribute such that all the lines in the range VMIN-VREL to VMAX+VREL are included. Finally, VCUTOFF limits the contribution of any line past the specified distance from </w:t>
-      </w:r>
-      <w:r>
-        <w:rPr>
-          <w:rFonts w:ascii="Times New Roman" w:hAnsi="Times New Roman"/>
-        </w:rPr>
-        <w:lastRenderedPageBreak/>
-        <w:t>the line centres. This simulates the sub-</w:t>
+        <w:t xml:space="preserve"> to contribute such that all the lines in the range VMIN-VREL to VMAX+VREL are included. Finally, VCUTOFF limits the contribution of any line past the specified distance from the line centres. This simulates the sub-</w:t>
       </w:r>
       <w:proofErr w:type="spellStart"/>
       <w:r>
@@ -40886,6 +41697,7 @@
         <w:rPr>
           <w:rFonts w:ascii="Copperplate" w:hAnsi="Copperplate"/>
         </w:rPr>
+        <w:lastRenderedPageBreak/>
         <w:t>Nemesis</w:t>
       </w:r>
       <w:r>
@@ -41268,7 +42080,6 @@
         <w:rPr>
           <w:rFonts w:ascii="Times New Roman" w:hAnsi="Times New Roman"/>
         </w:rPr>
-        <w:lastRenderedPageBreak/>
         <w:t>For most cases the Jacobeans can be calculated analytically, for which INUM=0. However, when trying to retrieve temperature and pressure together, the effects of varying each changes the atmospheric profile in a complicated and non-linear way. Hence, these Jacobeans have to be calculated by numerical differencing, set by INUM=1.</w:t>
       </w:r>
     </w:p>
@@ -41598,6 +42409,7 @@
         <w:rPr>
           <w:rFonts w:ascii="Copperplate Gothic Light" w:hAnsi="Copperplate Gothic Light"/>
         </w:rPr>
+        <w:lastRenderedPageBreak/>
         <w:t>N</w:t>
       </w:r>
       <w:r>
@@ -42243,14 +43055,7 @@
         <w:rPr>
           <w:rFonts w:ascii="Times New Roman" w:hAnsi="Times New Roman"/>
         </w:rPr>
-        <w:t xml:space="preserve"> is an ASCII file containing the computed </w:t>
-      </w:r>
-      <w:r>
-        <w:rPr>
-          <w:rFonts w:ascii="Times New Roman" w:hAnsi="Times New Roman"/>
-        </w:rPr>
-        <w:lastRenderedPageBreak/>
-        <w:t>spectra for each path defined in the .pat file. Two spectra are output per path, one which is the raw spectrum calculated at the k-table wavelengths/wavenumbers spanning the requested range and the second is this spectrum convolved with a box of width FWHM (defined in the .pat file) and output at the wavelengths/wavenumbers specified in the .pat file.</w:t>
+        <w:t xml:space="preserve"> is an ASCII file containing the computed spectra for each path defined in the .pat file. Two spectra are output per path, one which is the raw spectrum calculated at the k-table wavelengths/wavenumbers spanning the requested range and the second is this spectrum convolved with a box of width FWHM (defined in the .pat file) and output at the wavelengths/wavenumbers specified in the .pat file.</w:t>
       </w:r>
     </w:p>
     <w:p>
@@ -51223,7 +52028,7 @@
 </file>
 
 <file path=customXml/itemProps1.xml><?xml version="1.0" encoding="utf-8"?>
-<ds:datastoreItem xmlns:ds="http://schemas.openxmlformats.org/officeDocument/2006/customXml" ds:itemID="{AAA29315-6B41-884F-BB4D-A1F80E4B7350}">
+<ds:datastoreItem xmlns:ds="http://schemas.openxmlformats.org/officeDocument/2006/customXml" ds:itemID="{7C58F384-5FFD-2B4B-9AC9-24BC2A8C61F7}">
   <ds:schemaRefs>
     <ds:schemaRef ds:uri="http://schemas.openxmlformats.org/officeDocument/2006/bibliography"/>
   </ds:schemaRefs>
@@ -51231,7 +52036,7 @@
 </file>
 
 <file path=customXml/itemProps2.xml><?xml version="1.0" encoding="utf-8"?>
-<ds:datastoreItem xmlns:ds="http://schemas.openxmlformats.org/officeDocument/2006/customXml" ds:itemID="{7C58F384-5FFD-2B4B-9AC9-24BC2A8C61F7}">
+<ds:datastoreItem xmlns:ds="http://schemas.openxmlformats.org/officeDocument/2006/customXml" ds:itemID="{AAA29315-6B41-884F-BB4D-A1F80E4B7350}">
   <ds:schemaRefs>
     <ds:schemaRef ds:uri="http://schemas.openxmlformats.org/officeDocument/2006/bibliography"/>
   </ds:schemaRefs>

</xml_diff>